<commit_message>
Add unit tests and laboratory report
</commit_message>
<xml_diff>
--- a/lab_report.docx
+++ b/lab_report.docx
@@ -232,20 +232,11 @@
       </w:pPr>
       <w:r>
         <w:rPr>
-          <w:rFonts w:eastAsia="Calibri" w:cs="Times New Roman"/>
+          <w:rFonts w:ascii="Times New Roman" w:hAnsi="Times New Roman" w:eastAsia="Times New Roman"/>
+          <w:color w:val="000000"/>
           <w:sz w:val="24"/>
-          <w:szCs w:val="24"/>
         </w:rPr>
-        <w:t xml:space="preserve">по Лабораторной Работе № </w:t>
-      </w:r>
-      <w:r>
-        <w:rPr>
-          <w:rFonts w:eastAsia="Calibri" w:cs="Times New Roman"/>
-          <w:sz w:val="24"/>
-          <w:szCs w:val="24"/>
-          <w:lang w:val="ru-RU"/>
-        </w:rPr>
-        <w:t>1</w:t>
+        <w:t>по Лабораторной Работе № 4</w:t>
       </w:r>
     </w:p>
     <w:p>
@@ -550,1113 +541,851 @@
     </w:p>
     <w:p>
       <w:pPr>
-        <w:pStyle w:val="Normal"/>
-        <w:spacing w:before="0" w:after="0"/>
-        <w:ind w:hanging="0"/>
-        <w:jc w:val="left"/>
-        <w:rPr>
-          <w:b/>
-        </w:rPr>
+        <w:pageBreakBefore/>
+        <w:spacing w:after="160"/>
+        <w:jc w:val="center"/>
       </w:pPr>
       <w:r>
         <w:rPr>
+          <w:rFonts w:ascii="Times New Roman" w:hAnsi="Times New Roman" w:eastAsia="Times New Roman"/>
           <w:b/>
+          <w:color w:val="000000"/>
+          <w:sz w:val="28"/>
         </w:rPr>
-        <w:t xml:space="preserve">1. </w:t>
-      </w:r>
-      <w:r>
-        <w:rPr>
-          <w:b w:val="false"/>
-          <w:bCs w:val="false"/>
-        </w:rPr>
-        <w:t>Выполнил команду git clone &lt;ссылка на репозиторий&gt;, получив копию репозитория geometry_lib на свой компьютер.</w:t>
+        <w:t>План и результаты модульного тестирования</w:t>
       </w:r>
     </w:p>
     <w:p>
       <w:pPr>
-        <w:pStyle w:val="Normal"/>
-        <w:spacing w:before="0" w:after="0"/>
-        <w:ind w:hanging="0"/>
-        <w:jc w:val="left"/>
-        <w:rPr/>
-      </w:pPr>
-      <w:r>
-        <w:drawing>
-          <wp:anchor behindDoc="0" distT="0" distB="0" distL="0" distR="0" simplePos="0" locked="0" layoutInCell="0" allowOverlap="1" relativeHeight="3">
-            <wp:simplePos x="0" y="0"/>
-            <wp:positionH relativeFrom="column">
-              <wp:align>center</wp:align>
-            </wp:positionH>
-            <wp:positionV relativeFrom="paragraph">
-              <wp:posOffset>635</wp:posOffset>
-            </wp:positionV>
-            <wp:extent cx="6152515" cy="744855"/>
-            <wp:effectExtent l="0" t="0" r="0" b="0"/>
-            <wp:wrapSquare wrapText="largest"/>
-            <wp:docPr id="2" name="Image1" descr=""/>
-            <wp:cNvGraphicFramePr>
-              <a:graphicFrameLocks xmlns:a="http://schemas.openxmlformats.org/drawingml/2006/main" noChangeAspect="1"/>
-            </wp:cNvGraphicFramePr>
-            <a:graphic xmlns:a="http://schemas.openxmlformats.org/drawingml/2006/main">
-              <a:graphicData uri="http://schemas.openxmlformats.org/drawingml/2006/picture">
-                <pic:pic xmlns:pic="http://schemas.openxmlformats.org/drawingml/2006/picture">
-                  <pic:nvPicPr>
-                    <pic:cNvPr id="2" name="Image1" descr=""/>
-                    <pic:cNvPicPr>
-                      <a:picLocks noChangeAspect="1" noChangeArrowheads="1"/>
-                    </pic:cNvPicPr>
-                  </pic:nvPicPr>
-                  <pic:blipFill>
-                    <a:blip r:embed="rId3"/>
-                    <a:stretch>
-                      <a:fillRect/>
-                    </a:stretch>
-                  </pic:blipFill>
-                  <pic:spPr bwMode="auto">
-                    <a:xfrm>
-                      <a:off x="0" y="0"/>
-                      <a:ext cx="6152515" cy="744855"/>
-                    </a:xfrm>
-                    <a:prstGeom prst="rect">
-                      <a:avLst/>
-                    </a:prstGeom>
-                    <a:noFill/>
-                  </pic:spPr>
-                </pic:pic>
-              </a:graphicData>
-            </a:graphic>
-          </wp:anchor>
-        </w:drawing>
-      </w:r>
+        <w:keepNext/>
+        <w:spacing w:before="200" w:after="120"/>
+      </w:pPr>
       <w:r>
         <w:rPr>
+          <w:rFonts w:ascii="Times New Roman" w:hAnsi="Times New Roman" w:eastAsia="Times New Roman"/>
           <w:b/>
+          <w:color w:val="000000"/>
+          <w:sz w:val="26"/>
         </w:rPr>
-        <w:t xml:space="preserve">2.  </w:t>
-      </w:r>
-      <w:r>
-        <w:rPr>
-          <w:b w:val="false"/>
-          <w:bCs w:val="false"/>
-        </w:rPr>
-        <w:t>Создал новую ветку new_features-558418</w:t>
+        <w:t>1. Цели и задачи тестирования</w:t>
       </w:r>
     </w:p>
     <w:p>
       <w:pPr>
-        <w:pStyle w:val="Normal"/>
-        <w:spacing w:before="0" w:after="0"/>
-        <w:ind w:hanging="0"/>
-        <w:jc w:val="left"/>
-        <w:rPr/>
-      </w:pPr>
-      <w:r>
-        <w:drawing>
-          <wp:anchor behindDoc="0" distT="0" distB="0" distL="0" distR="0" simplePos="0" locked="0" layoutInCell="0" allowOverlap="1" relativeHeight="4">
-            <wp:simplePos x="0" y="0"/>
-            <wp:positionH relativeFrom="column">
-              <wp:align>center</wp:align>
-            </wp:positionH>
-            <wp:positionV relativeFrom="paragraph">
-              <wp:posOffset>635</wp:posOffset>
-            </wp:positionV>
-            <wp:extent cx="6152515" cy="767080"/>
-            <wp:effectExtent l="0" t="0" r="0" b="0"/>
-            <wp:wrapSquare wrapText="largest"/>
-            <wp:docPr id="3" name="Image2" descr=""/>
-            <wp:cNvGraphicFramePr>
-              <a:graphicFrameLocks xmlns:a="http://schemas.openxmlformats.org/drawingml/2006/main" noChangeAspect="1"/>
-            </wp:cNvGraphicFramePr>
-            <a:graphic xmlns:a="http://schemas.openxmlformats.org/drawingml/2006/main">
-              <a:graphicData uri="http://schemas.openxmlformats.org/drawingml/2006/picture">
-                <pic:pic xmlns:pic="http://schemas.openxmlformats.org/drawingml/2006/picture">
-                  <pic:nvPicPr>
-                    <pic:cNvPr id="3" name="Image2" descr=""/>
-                    <pic:cNvPicPr>
-                      <a:picLocks noChangeAspect="1" noChangeArrowheads="1"/>
-                    </pic:cNvPicPr>
-                  </pic:nvPicPr>
-                  <pic:blipFill>
-                    <a:blip r:embed="rId4"/>
-                    <a:stretch>
-                      <a:fillRect/>
-                    </a:stretch>
-                  </pic:blipFill>
-                  <pic:spPr bwMode="auto">
-                    <a:xfrm>
-                      <a:off x="0" y="0"/>
-                      <a:ext cx="6152515" cy="767080"/>
-                    </a:xfrm>
-                    <a:prstGeom prst="rect">
-                      <a:avLst/>
-                    </a:prstGeom>
-                    <a:noFill/>
-                  </pic:spPr>
-                </pic:pic>
-              </a:graphicData>
-            </a:graphic>
-          </wp:anchor>
-        </w:drawing>
-      </w:r>
+        <w:spacing w:after="120" w:line="276" w:lineRule="auto"/>
+        <w:jc w:val="both"/>
+      </w:pPr>
       <w:r>
         <w:rPr>
-          <w:b/>
+          <w:rFonts w:ascii="Times New Roman" w:hAnsi="Times New Roman" w:eastAsia="Times New Roman"/>
+          <w:color w:val="000000"/>
+          <w:sz w:val="24"/>
         </w:rPr>
-        <w:t xml:space="preserve">3. </w:t>
-      </w:r>
-      <w:r>
-        <w:rPr>
-          <w:b w:val="false"/>
-          <w:bCs w:val="false"/>
-          <w:i w:val="false"/>
-          <w:iCs w:val="false"/>
-        </w:rPr>
-        <w:t>Создал файл rectangle.py через консоль используя утилиту nano</w:t>
+        <w:t>Цель работы — проверить корректность вычисления площади и периметра четырёх геометрических фигур. Задачи тестирования: подготовить независимые unit-тесты, сравнить результаты функций с заранее рассчитанными значениями и зафиксировать результат автоматического запуска.</w:t>
       </w:r>
     </w:p>
     <w:p>
       <w:pPr>
-        <w:pStyle w:val="Normal"/>
-        <w:spacing w:before="0" w:after="0"/>
-        <w:ind w:hanging="0"/>
-        <w:jc w:val="left"/>
-        <w:rPr/>
-      </w:pPr>
-      <w:r>
-        <w:drawing>
-          <wp:anchor behindDoc="0" distT="0" distB="0" distL="0" distR="0" simplePos="0" locked="0" layoutInCell="0" allowOverlap="1" relativeHeight="5">
-            <wp:simplePos x="0" y="0"/>
-            <wp:positionH relativeFrom="column">
-              <wp:align>center</wp:align>
-            </wp:positionH>
-            <wp:positionV relativeFrom="paragraph">
-              <wp:posOffset>635</wp:posOffset>
-            </wp:positionV>
-            <wp:extent cx="6152515" cy="424815"/>
-            <wp:effectExtent l="0" t="0" r="0" b="0"/>
-            <wp:wrapSquare wrapText="largest"/>
-            <wp:docPr id="4" name="Image3" descr=""/>
-            <wp:cNvGraphicFramePr>
-              <a:graphicFrameLocks xmlns:a="http://schemas.openxmlformats.org/drawingml/2006/main" noChangeAspect="1"/>
-            </wp:cNvGraphicFramePr>
-            <a:graphic xmlns:a="http://schemas.openxmlformats.org/drawingml/2006/main">
-              <a:graphicData uri="http://schemas.openxmlformats.org/drawingml/2006/picture">
-                <pic:pic xmlns:pic="http://schemas.openxmlformats.org/drawingml/2006/picture">
-                  <pic:nvPicPr>
-                    <pic:cNvPr id="4" name="Image3" descr=""/>
-                    <pic:cNvPicPr>
-                      <a:picLocks noChangeAspect="1" noChangeArrowheads="1"/>
-                    </pic:cNvPicPr>
-                  </pic:nvPicPr>
-                  <pic:blipFill>
-                    <a:blip r:embed="rId5"/>
-                    <a:stretch>
-                      <a:fillRect/>
-                    </a:stretch>
-                  </pic:blipFill>
-                  <pic:spPr bwMode="auto">
-                    <a:xfrm>
-                      <a:off x="0" y="0"/>
-                      <a:ext cx="6152515" cy="424815"/>
-                    </a:xfrm>
-                    <a:prstGeom prst="rect">
-                      <a:avLst/>
-                    </a:prstGeom>
-                    <a:noFill/>
-                  </pic:spPr>
-                </pic:pic>
-              </a:graphicData>
-            </a:graphic>
-          </wp:anchor>
-        </w:drawing>
-      </w:r>
+        <w:keepNext/>
+        <w:spacing w:before="200" w:after="120"/>
+      </w:pPr>
       <w:r>
         <w:rPr>
+          <w:rFonts w:ascii="Times New Roman" w:hAnsi="Times New Roman" w:eastAsia="Times New Roman"/>
           <w:b/>
+          <w:color w:val="000000"/>
+          <w:sz w:val="26"/>
         </w:rPr>
-        <w:t xml:space="preserve">4. </w:t>
-      </w:r>
-      <w:r>
-        <w:rPr>
-          <w:b w:val="false"/>
-          <w:bCs w:val="false"/>
-        </w:rPr>
-        <w:t>Сделал первый коммит в ветке new_features-558418 с сообщением о добавлении нового файла</w:t>
+        <w:t>2. Описание тестируемого продукта</w:t>
       </w:r>
     </w:p>
     <w:p>
       <w:pPr>
-        <w:pStyle w:val="Normal"/>
-        <w:spacing w:before="0" w:after="0"/>
-        <w:ind w:hanging="0"/>
-        <w:jc w:val="left"/>
-        <w:rPr/>
-      </w:pPr>
-      <w:r>
-        <w:drawing>
-          <wp:anchor behindDoc="0" distT="0" distB="0" distL="0" distR="0" simplePos="0" locked="0" layoutInCell="0" allowOverlap="1" relativeHeight="6">
-            <wp:simplePos x="0" y="0"/>
-            <wp:positionH relativeFrom="column">
-              <wp:align>center</wp:align>
-            </wp:positionH>
-            <wp:positionV relativeFrom="paragraph">
-              <wp:posOffset>635</wp:posOffset>
-            </wp:positionV>
-            <wp:extent cx="6152515" cy="714375"/>
-            <wp:effectExtent l="0" t="0" r="0" b="0"/>
-            <wp:wrapSquare wrapText="largest"/>
-            <wp:docPr id="5" name="Image4" descr=""/>
-            <wp:cNvGraphicFramePr>
-              <a:graphicFrameLocks xmlns:a="http://schemas.openxmlformats.org/drawingml/2006/main" noChangeAspect="1"/>
-            </wp:cNvGraphicFramePr>
-            <a:graphic xmlns:a="http://schemas.openxmlformats.org/drawingml/2006/main">
-              <a:graphicData uri="http://schemas.openxmlformats.org/drawingml/2006/picture">
-                <pic:pic xmlns:pic="http://schemas.openxmlformats.org/drawingml/2006/picture">
-                  <pic:nvPicPr>
-                    <pic:cNvPr id="5" name="Image4" descr=""/>
-                    <pic:cNvPicPr>
-                      <a:picLocks noChangeAspect="1" noChangeArrowheads="1"/>
-                    </pic:cNvPicPr>
-                  </pic:nvPicPr>
-                  <pic:blipFill>
-                    <a:blip r:embed="rId6"/>
-                    <a:stretch>
-                      <a:fillRect/>
-                    </a:stretch>
-                  </pic:blipFill>
-                  <pic:spPr bwMode="auto">
-                    <a:xfrm>
-                      <a:off x="0" y="0"/>
-                      <a:ext cx="6152515" cy="714375"/>
-                    </a:xfrm>
-                    <a:prstGeom prst="rect">
-                      <a:avLst/>
-                    </a:prstGeom>
-                    <a:noFill/>
-                  </pic:spPr>
-                </pic:pic>
-              </a:graphicData>
-            </a:graphic>
-          </wp:anchor>
-        </w:drawing>
-      </w:r>
+        <w:spacing w:after="120" w:line="276" w:lineRule="auto"/>
+        <w:jc w:val="both"/>
+      </w:pPr>
       <w:r>
         <w:rPr>
-          <w:b/>
+          <w:rFonts w:ascii="Times New Roman" w:hAnsi="Times New Roman" w:eastAsia="Times New Roman"/>
+          <w:color w:val="000000"/>
+          <w:sz w:val="24"/>
         </w:rPr>
-        <w:t xml:space="preserve">5. </w:t>
-      </w:r>
-      <w:r>
-        <w:rPr>
-          <w:b w:val="false"/>
-          <w:bCs w:val="false"/>
-        </w:rPr>
-        <w:t>Создал файл triangle.py при помощи утилиты nano</w:t>
+        <w:t>Тестируется Python-приложение из четырёх модулей: circle, rectangle, square и triangle. Каждый модуль содержит функции area и perimeter. Функции принимают числовые размеры фигуры и возвращают результат вычисления по стандартной геометрической формуле. Проверка допустимости входных данных приложением не выполняется.</w:t>
       </w:r>
     </w:p>
     <w:p>
       <w:pPr>
-        <w:pStyle w:val="Normal"/>
-        <w:spacing w:before="0" w:after="0"/>
-        <w:ind w:hanging="0"/>
-        <w:jc w:val="left"/>
-        <w:rPr>
-          <w:b w:val="false"/>
-          <w:bCs w:val="false"/>
-        </w:rPr>
-      </w:pPr>
-      <w:r>
-        <w:drawing>
-          <wp:anchor behindDoc="0" distT="0" distB="0" distL="0" distR="0" simplePos="0" locked="0" layoutInCell="0" allowOverlap="1" relativeHeight="7">
-            <wp:simplePos x="0" y="0"/>
-            <wp:positionH relativeFrom="column">
-              <wp:align>center</wp:align>
-            </wp:positionH>
-            <wp:positionV relativeFrom="paragraph">
-              <wp:posOffset>635</wp:posOffset>
-            </wp:positionV>
-            <wp:extent cx="6152515" cy="370205"/>
-            <wp:effectExtent l="0" t="0" r="0" b="0"/>
-            <wp:wrapSquare wrapText="largest"/>
-            <wp:docPr id="6" name="Image5" descr=""/>
-            <wp:cNvGraphicFramePr>
-              <a:graphicFrameLocks xmlns:a="http://schemas.openxmlformats.org/drawingml/2006/main" noChangeAspect="1"/>
-            </wp:cNvGraphicFramePr>
-            <a:graphic xmlns:a="http://schemas.openxmlformats.org/drawingml/2006/main">
-              <a:graphicData uri="http://schemas.openxmlformats.org/drawingml/2006/picture">
-                <pic:pic xmlns:pic="http://schemas.openxmlformats.org/drawingml/2006/picture">
-                  <pic:nvPicPr>
-                    <pic:cNvPr id="6" name="Image5" descr=""/>
-                    <pic:cNvPicPr>
-                      <a:picLocks noChangeAspect="1" noChangeArrowheads="1"/>
-                    </pic:cNvPicPr>
-                  </pic:nvPicPr>
-                  <pic:blipFill>
-                    <a:blip r:embed="rId7"/>
-                    <a:stretch>
-                      <a:fillRect/>
-                    </a:stretch>
-                  </pic:blipFill>
-                  <pic:spPr bwMode="auto">
-                    <a:xfrm>
-                      <a:off x="0" y="0"/>
-                      <a:ext cx="6152515" cy="370205"/>
-                    </a:xfrm>
-                    <a:prstGeom prst="rect">
-                      <a:avLst/>
-                    </a:prstGeom>
-                    <a:noFill/>
-                  </pic:spPr>
-                </pic:pic>
-              </a:graphicData>
-            </a:graphic>
-          </wp:anchor>
-        </w:drawing>
-        <w:drawing>
-          <wp:anchor behindDoc="0" distT="0" distB="0" distL="0" distR="0" simplePos="0" locked="0" layoutInCell="0" allowOverlap="1" relativeHeight="9">
-            <wp:simplePos x="0" y="0"/>
-            <wp:positionH relativeFrom="column">
-              <wp:posOffset>5715</wp:posOffset>
-            </wp:positionH>
-            <wp:positionV relativeFrom="paragraph">
-              <wp:posOffset>732155</wp:posOffset>
-            </wp:positionV>
-            <wp:extent cx="6152515" cy="2702560"/>
-            <wp:effectExtent l="0" t="0" r="0" b="0"/>
-            <wp:wrapSquare wrapText="largest"/>
-            <wp:docPr id="7" name="Image7" descr=""/>
-            <wp:cNvGraphicFramePr>
-              <a:graphicFrameLocks xmlns:a="http://schemas.openxmlformats.org/drawingml/2006/main" noChangeAspect="1"/>
-            </wp:cNvGraphicFramePr>
-            <a:graphic xmlns:a="http://schemas.openxmlformats.org/drawingml/2006/main">
-              <a:graphicData uri="http://schemas.openxmlformats.org/drawingml/2006/picture">
-                <pic:pic xmlns:pic="http://schemas.openxmlformats.org/drawingml/2006/picture">
-                  <pic:nvPicPr>
-                    <pic:cNvPr id="7" name="Image7" descr=""/>
-                    <pic:cNvPicPr>
-                      <a:picLocks noChangeAspect="1" noChangeArrowheads="1"/>
-                    </pic:cNvPicPr>
-                  </pic:nvPicPr>
-                  <pic:blipFill>
-                    <a:blip r:embed="rId8"/>
-                    <a:stretch>
-                      <a:fillRect/>
-                    </a:stretch>
-                  </pic:blipFill>
-                  <pic:spPr bwMode="auto">
-                    <a:xfrm>
-                      <a:off x="0" y="0"/>
-                      <a:ext cx="6152515" cy="2702560"/>
-                    </a:xfrm>
-                    <a:prstGeom prst="rect">
-                      <a:avLst/>
-                    </a:prstGeom>
-                    <a:noFill/>
-                  </pic:spPr>
-                </pic:pic>
-              </a:graphicData>
-            </a:graphic>
-          </wp:anchor>
-        </w:drawing>
-      </w:r>
+        <w:keepNext/>
+        <w:spacing w:before="200" w:after="120"/>
+      </w:pPr>
       <w:r>
         <w:rPr>
+          <w:rFonts w:ascii="Times New Roman" w:hAnsi="Times New Roman" w:eastAsia="Times New Roman"/>
           <w:b/>
-          <w:bCs w:val="false"/>
+          <w:color w:val="000000"/>
+          <w:sz w:val="26"/>
         </w:rPr>
-        <w:t xml:space="preserve">6. </w:t>
-      </w:r>
-      <w:r>
-        <w:rPr>
-          <w:b w:val="false"/>
-          <w:bCs w:val="false"/>
-        </w:rPr>
-        <w:t>Исправил ошибку в вычислении периметра в файле rectangle.py</w:t>
+        <w:t>3. Область тестирования</w:t>
       </w:r>
     </w:p>
     <w:p>
       <w:pPr>
-        <w:pStyle w:val="Normal"/>
-        <w:spacing w:before="0" w:after="0"/>
-        <w:ind w:hanging="0"/>
-        <w:jc w:val="left"/>
-        <w:rPr/>
+        <w:spacing w:after="120" w:line="276" w:lineRule="auto"/>
+        <w:jc w:val="both"/>
       </w:pPr>
       <w:r>
         <w:rPr>
-          <w:b/>
+          <w:rFonts w:ascii="Times New Roman" w:hAnsi="Times New Roman" w:eastAsia="Times New Roman"/>
+          <w:color w:val="000000"/>
+          <w:sz w:val="24"/>
         </w:rPr>
-        <w:t xml:space="preserve">7. </w:t>
-      </w:r>
-      <w:r>
-        <w:rPr>
-          <w:b w:val="false"/>
-          <w:bCs w:val="false"/>
-        </w:rPr>
-        <w:t>Создал коммит “error fixed” в ветку new_features-558418 включающий исправления в файле rectangle.py</w:t>
+        <w:t>В область тестирования входят восемь функций: площадь и периметр круга, прямоугольника, квадрата и треугольника. Проверяются целые и дробные значения, а также граничный случай с нулевым размером. Внешние интерфейсы, производительность и безопасность не рассматриваются.</w:t>
       </w:r>
     </w:p>
     <w:p>
       <w:pPr>
-        <w:pStyle w:val="Normal"/>
-        <w:spacing w:before="0" w:after="0"/>
-        <w:ind w:hanging="0"/>
-        <w:jc w:val="left"/>
-        <w:rPr/>
-      </w:pPr>
-      <w:r>
-        <w:drawing>
-          <wp:anchor behindDoc="0" distT="0" distB="0" distL="0" distR="0" simplePos="0" locked="0" layoutInCell="0" allowOverlap="1" relativeHeight="8">
-            <wp:simplePos x="0" y="0"/>
-            <wp:positionH relativeFrom="column">
-              <wp:posOffset>0</wp:posOffset>
-            </wp:positionH>
-            <wp:positionV relativeFrom="paragraph">
-              <wp:posOffset>-73660</wp:posOffset>
-            </wp:positionV>
-            <wp:extent cx="6152515" cy="882015"/>
-            <wp:effectExtent l="0" t="0" r="0" b="0"/>
-            <wp:wrapSquare wrapText="largest"/>
-            <wp:docPr id="8" name="Image6" descr=""/>
-            <wp:cNvGraphicFramePr>
-              <a:graphicFrameLocks xmlns:a="http://schemas.openxmlformats.org/drawingml/2006/main" noChangeAspect="1"/>
-            </wp:cNvGraphicFramePr>
-            <a:graphic xmlns:a="http://schemas.openxmlformats.org/drawingml/2006/main">
-              <a:graphicData uri="http://schemas.openxmlformats.org/drawingml/2006/picture">
-                <pic:pic xmlns:pic="http://schemas.openxmlformats.org/drawingml/2006/picture">
-                  <pic:nvPicPr>
-                    <pic:cNvPr id="8" name="Image6" descr=""/>
-                    <pic:cNvPicPr>
-                      <a:picLocks noChangeAspect="1" noChangeArrowheads="1"/>
-                    </pic:cNvPicPr>
-                  </pic:nvPicPr>
-                  <pic:blipFill>
-                    <a:blip r:embed="rId9"/>
-                    <a:stretch>
-                      <a:fillRect/>
-                    </a:stretch>
-                  </pic:blipFill>
-                  <pic:spPr bwMode="auto">
-                    <a:xfrm>
-                      <a:off x="0" y="0"/>
-                      <a:ext cx="6152515" cy="882015"/>
-                    </a:xfrm>
-                    <a:prstGeom prst="rect">
-                      <a:avLst/>
-                    </a:prstGeom>
-                    <a:noFill/>
-                  </pic:spPr>
-                </pic:pic>
-              </a:graphicData>
-            </a:graphic>
-          </wp:anchor>
-        </w:drawing>
-      </w:r>
+        <w:keepNext/>
+        <w:spacing w:before="200" w:after="120"/>
+      </w:pPr>
       <w:r>
         <w:rPr>
+          <w:rFonts w:ascii="Times New Roman" w:hAnsi="Times New Roman" w:eastAsia="Times New Roman"/>
           <w:b/>
+          <w:color w:val="000000"/>
+          <w:sz w:val="26"/>
         </w:rPr>
-        <w:t xml:space="preserve">8.  </w:t>
-      </w:r>
-      <w:r>
-        <w:rPr>
-          <w:b w:val="false"/>
-          <w:bCs w:val="false"/>
-        </w:rPr>
-        <w:t xml:space="preserve">Построил граф истории всего репозитория находясь в ветке main с односрочным выводом (флаг –oneline) </w:t>
+        <w:t>4. Стратегия тестирования</w:t>
       </w:r>
     </w:p>
     <w:p>
       <w:pPr>
-        <w:pStyle w:val="Normal"/>
-        <w:spacing w:before="0" w:after="0"/>
-        <w:ind w:hanging="0"/>
-        <w:jc w:val="left"/>
-        <w:rPr/>
-      </w:pPr>
-      <w:r>
-        <w:drawing>
-          <wp:anchor behindDoc="0" distT="0" distB="0" distL="0" distR="0" simplePos="0" locked="0" layoutInCell="0" allowOverlap="1" relativeHeight="10">
-            <wp:simplePos x="0" y="0"/>
-            <wp:positionH relativeFrom="column">
-              <wp:align>center</wp:align>
-            </wp:positionH>
-            <wp:positionV relativeFrom="paragraph">
-              <wp:posOffset>635</wp:posOffset>
-            </wp:positionV>
-            <wp:extent cx="6152515" cy="2493645"/>
-            <wp:effectExtent l="0" t="0" r="0" b="0"/>
-            <wp:wrapSquare wrapText="largest"/>
-            <wp:docPr id="9" name="Image8" descr=""/>
-            <wp:cNvGraphicFramePr>
-              <a:graphicFrameLocks xmlns:a="http://schemas.openxmlformats.org/drawingml/2006/main" noChangeAspect="1"/>
-            </wp:cNvGraphicFramePr>
-            <a:graphic xmlns:a="http://schemas.openxmlformats.org/drawingml/2006/main">
-              <a:graphicData uri="http://schemas.openxmlformats.org/drawingml/2006/picture">
-                <pic:pic xmlns:pic="http://schemas.openxmlformats.org/drawingml/2006/picture">
-                  <pic:nvPicPr>
-                    <pic:cNvPr id="9" name="Image8" descr=""/>
-                    <pic:cNvPicPr>
-                      <a:picLocks noChangeAspect="1" noChangeArrowheads="1"/>
-                    </pic:cNvPicPr>
-                  </pic:nvPicPr>
-                  <pic:blipFill>
-                    <a:blip r:embed="rId10"/>
-                    <a:stretch>
-                      <a:fillRect/>
-                    </a:stretch>
-                  </pic:blipFill>
-                  <pic:spPr bwMode="auto">
-                    <a:xfrm>
-                      <a:off x="0" y="0"/>
-                      <a:ext cx="6152515" cy="2493645"/>
-                    </a:xfrm>
-                    <a:prstGeom prst="rect">
-                      <a:avLst/>
-                    </a:prstGeom>
-                    <a:noFill/>
-                  </pic:spPr>
-                </pic:pic>
-              </a:graphicData>
-            </a:graphic>
-          </wp:anchor>
-        </w:drawing>
-      </w:r>
+        <w:spacing w:after="120" w:line="276" w:lineRule="auto"/>
+        <w:jc w:val="both"/>
+      </w:pPr>
       <w:r>
         <w:rPr>
-          <w:b/>
+          <w:rFonts w:ascii="Times New Roman" w:hAnsi="Times New Roman" w:eastAsia="Times New Roman"/>
+          <w:color w:val="000000"/>
+          <w:sz w:val="24"/>
         </w:rPr>
-        <w:t xml:space="preserve">9.  </w:t>
-      </w:r>
-      <w:r>
-        <w:rPr>
-          <w:b w:val="false"/>
-          <w:bCs w:val="false"/>
-        </w:rPr>
-        <w:t>Перешел в ветку new_features-558418 и построил однострочный граф только этой ветки, а именно вывел только два последних коммита.</w:t>
+        <w:t>Используется функциональное модульное тестирование средствами стандартной библиотеки unittest. Тесты оформлены в классах, унаследованных от unittest.TestCase, и запускаются командой python -m unittest discover -s tests -v. Для точных результатов применяется assertEqual, для вычислений с числом π — assertAlmostEqual.</w:t>
       </w:r>
     </w:p>
     <w:p>
       <w:pPr>
-        <w:pStyle w:val="Normal"/>
-        <w:spacing w:before="0" w:after="0"/>
-        <w:ind w:hanging="0"/>
-        <w:jc w:val="left"/>
-        <w:rPr/>
-      </w:pPr>
-      <w:r>
-        <w:drawing>
-          <wp:anchor behindDoc="0" distT="0" distB="0" distL="0" distR="0" simplePos="0" locked="0" layoutInCell="0" allowOverlap="1" relativeHeight="11">
-            <wp:simplePos x="0" y="0"/>
-            <wp:positionH relativeFrom="column">
-              <wp:align>center</wp:align>
-            </wp:positionH>
-            <wp:positionV relativeFrom="paragraph">
-              <wp:posOffset>635</wp:posOffset>
-            </wp:positionV>
-            <wp:extent cx="6152515" cy="512445"/>
-            <wp:effectExtent l="0" t="0" r="0" b="0"/>
-            <wp:wrapSquare wrapText="largest"/>
-            <wp:docPr id="10" name="Image9" descr=""/>
-            <wp:cNvGraphicFramePr>
-              <a:graphicFrameLocks xmlns:a="http://schemas.openxmlformats.org/drawingml/2006/main" noChangeAspect="1"/>
-            </wp:cNvGraphicFramePr>
-            <a:graphic xmlns:a="http://schemas.openxmlformats.org/drawingml/2006/main">
-              <a:graphicData uri="http://schemas.openxmlformats.org/drawingml/2006/picture">
-                <pic:pic xmlns:pic="http://schemas.openxmlformats.org/drawingml/2006/picture">
-                  <pic:nvPicPr>
-                    <pic:cNvPr id="10" name="Image9" descr=""/>
-                    <pic:cNvPicPr>
-                      <a:picLocks noChangeAspect="1" noChangeArrowheads="1"/>
-                    </pic:cNvPicPr>
-                  </pic:nvPicPr>
-                  <pic:blipFill>
-                    <a:blip r:embed="rId11"/>
-                    <a:stretch>
-                      <a:fillRect/>
-                    </a:stretch>
-                  </pic:blipFill>
-                  <pic:spPr bwMode="auto">
-                    <a:xfrm>
-                      <a:off x="0" y="0"/>
-                      <a:ext cx="6152515" cy="512445"/>
-                    </a:xfrm>
-                    <a:prstGeom prst="rect">
-                      <a:avLst/>
-                    </a:prstGeom>
-                    <a:noFill/>
-                  </pic:spPr>
-                </pic:pic>
-              </a:graphicData>
-            </a:graphic>
-          </wp:anchor>
-        </w:drawing>
-      </w:r>
+        <w:keepNext/>
+        <w:spacing w:before="200" w:after="120"/>
+      </w:pPr>
       <w:r>
         <w:rPr>
+          <w:rFonts w:ascii="Times New Roman" w:hAnsi="Times New Roman" w:eastAsia="Times New Roman"/>
           <w:b/>
+          <w:color w:val="000000"/>
+          <w:sz w:val="26"/>
         </w:rPr>
-        <w:t xml:space="preserve">10. </w:t>
-      </w:r>
-      <w:r>
-        <w:rPr>
-          <w:b w:val="false"/>
-          <w:bCs w:val="false"/>
-        </w:rPr>
-        <w:t>Просмотрел историю двух последних коммитов по хешам в ветке new_features-558418</w:t>
+        <w:t>5. Критерии приёмки</w:t>
       </w:r>
     </w:p>
     <w:p>
       <w:pPr>
-        <w:pStyle w:val="Normal"/>
-        <w:spacing w:before="0" w:after="0"/>
-        <w:ind w:hanging="0"/>
-        <w:jc w:val="left"/>
-        <w:rPr/>
+        <w:spacing w:after="120" w:line="276" w:lineRule="auto"/>
+        <w:jc w:val="both"/>
       </w:pPr>
       <w:r>
-        <w:rPr/>
-        <w:drawing>
-          <wp:anchor behindDoc="0" distT="0" distB="0" distL="0" distR="0" simplePos="0" locked="0" layoutInCell="0" allowOverlap="1" relativeHeight="12">
-            <wp:simplePos x="0" y="0"/>
-            <wp:positionH relativeFrom="column">
-              <wp:posOffset>-5715</wp:posOffset>
-            </wp:positionH>
-            <wp:positionV relativeFrom="paragraph">
-              <wp:posOffset>3180080</wp:posOffset>
-            </wp:positionV>
-            <wp:extent cx="6152515" cy="4339590"/>
-            <wp:effectExtent l="0" t="0" r="0" b="0"/>
-            <wp:wrapSquare wrapText="largest"/>
-            <wp:docPr id="11" name="Image10" descr=""/>
-            <wp:cNvGraphicFramePr>
-              <a:graphicFrameLocks xmlns:a="http://schemas.openxmlformats.org/drawingml/2006/main" noChangeAspect="1"/>
-            </wp:cNvGraphicFramePr>
-            <a:graphic xmlns:a="http://schemas.openxmlformats.org/drawingml/2006/main">
-              <a:graphicData uri="http://schemas.openxmlformats.org/drawingml/2006/picture">
-                <pic:pic xmlns:pic="http://schemas.openxmlformats.org/drawingml/2006/picture">
-                  <pic:nvPicPr>
-                    <pic:cNvPr id="11" name="Image10" descr=""/>
-                    <pic:cNvPicPr>
-                      <a:picLocks noChangeAspect="1" noChangeArrowheads="1"/>
-                    </pic:cNvPicPr>
-                  </pic:nvPicPr>
-                  <pic:blipFill>
-                    <a:blip r:embed="rId12"/>
-                    <a:stretch>
-                      <a:fillRect/>
-                    </a:stretch>
-                  </pic:blipFill>
-                  <pic:spPr bwMode="auto">
-                    <a:xfrm>
-                      <a:off x="0" y="0"/>
-                      <a:ext cx="6152515" cy="4339590"/>
-                    </a:xfrm>
-                    <a:prstGeom prst="rect">
-                      <a:avLst/>
-                    </a:prstGeom>
-                    <a:noFill/>
-                  </pic:spPr>
-                </pic:pic>
-              </a:graphicData>
-            </a:graphic>
-          </wp:anchor>
-        </w:drawing>
-        <w:drawing>
-          <wp:anchor behindDoc="0" distT="0" distB="0" distL="0" distR="0" simplePos="0" locked="0" layoutInCell="0" allowOverlap="1" relativeHeight="15">
-            <wp:simplePos x="0" y="0"/>
-            <wp:positionH relativeFrom="column">
-              <wp:posOffset>-5715</wp:posOffset>
-            </wp:positionH>
-            <wp:positionV relativeFrom="paragraph">
-              <wp:posOffset>21590</wp:posOffset>
-            </wp:positionV>
-            <wp:extent cx="6152515" cy="3106420"/>
-            <wp:effectExtent l="0" t="0" r="0" b="0"/>
-            <wp:wrapSquare wrapText="largest"/>
-            <wp:docPr id="12" name="Image13" descr=""/>
-            <wp:cNvGraphicFramePr>
-              <a:graphicFrameLocks xmlns:a="http://schemas.openxmlformats.org/drawingml/2006/main" noChangeAspect="1"/>
-            </wp:cNvGraphicFramePr>
-            <a:graphic xmlns:a="http://schemas.openxmlformats.org/drawingml/2006/main">
-              <a:graphicData uri="http://schemas.openxmlformats.org/drawingml/2006/picture">
-                <pic:pic xmlns:pic="http://schemas.openxmlformats.org/drawingml/2006/picture">
-                  <pic:nvPicPr>
-                    <pic:cNvPr id="12" name="Image13" descr=""/>
-                    <pic:cNvPicPr>
-                      <a:picLocks noChangeAspect="1" noChangeArrowheads="1"/>
-                    </pic:cNvPicPr>
-                  </pic:nvPicPr>
-                  <pic:blipFill>
-                    <a:blip r:embed="rId13"/>
-                    <a:stretch>
-                      <a:fillRect/>
-                    </a:stretch>
-                  </pic:blipFill>
-                  <pic:spPr bwMode="auto">
-                    <a:xfrm>
-                      <a:off x="0" y="0"/>
-                      <a:ext cx="6152515" cy="3106420"/>
-                    </a:xfrm>
-                    <a:prstGeom prst="rect">
-                      <a:avLst/>
-                    </a:prstGeom>
-                    <a:noFill/>
-                  </pic:spPr>
-                </pic:pic>
-              </a:graphicData>
-            </a:graphic>
-          </wp:anchor>
-        </w:drawing>
+        <w:rPr>
+          <w:rFonts w:ascii="Times New Roman" w:hAnsi="Times New Roman" w:eastAsia="Times New Roman"/>
+          <w:color w:val="000000"/>
+          <w:sz w:val="24"/>
+        </w:rPr>
+        <w:t>Работа считается принятой, если unittest обнаруживает тесты всех четырёх фигур, каждая функция area и perimeter проверена хотя бы одним тестом, все тесты завершаются со статусом OK, а модули приложения импортируются без ошибок.</w:t>
       </w:r>
     </w:p>
     <w:p>
       <w:pPr>
-        <w:pStyle w:val="Normal"/>
-        <w:spacing w:before="0" w:after="0"/>
-        <w:ind w:firstLine="709"/>
-        <w:jc w:val="both"/>
-        <w:rPr/>
+        <w:keepNext/>
+        <w:spacing w:before="200" w:after="120"/>
       </w:pPr>
       <w:r>
-        <w:rPr/>
+        <w:rPr>
+          <w:rFonts w:ascii="Times New Roman" w:hAnsi="Times New Roman" w:eastAsia="Times New Roman"/>
+          <w:b/>
+          <w:color w:val="000000"/>
+          <w:sz w:val="26"/>
+        </w:rPr>
+        <w:t>6. Ожидаемые результаты</w:t>
       </w:r>
     </w:p>
     <w:p>
       <w:pPr>
-        <w:pStyle w:val="Normal"/>
-        <w:spacing w:before="0" w:after="0"/>
-        <w:ind w:firstLine="709"/>
+        <w:spacing w:after="120" w:line="276" w:lineRule="auto"/>
         <w:jc w:val="both"/>
-        <w:rPr/>
       </w:pPr>
       <w:r>
-        <w:rPr/>
+        <w:rPr>
+          <w:rFonts w:ascii="Times New Roman" w:hAnsi="Times New Roman" w:eastAsia="Times New Roman"/>
+          <w:color w:val="000000"/>
+          <w:sz w:val="24"/>
+        </w:rPr>
+        <w:t>Ожидается успешное выполнение 12 тестов. Для каждого набора входных данных результат функции должен совпасть с рассчитанным значением. При несовпадении unittest должен вывести имя проваленного теста и описание ошибки сравнения.</w:t>
       </w:r>
     </w:p>
     <w:p>
       <w:pPr>
-        <w:pStyle w:val="Normal"/>
-        <w:spacing w:before="0" w:after="0"/>
-        <w:ind w:firstLine="709"/>
-        <w:jc w:val="both"/>
-        <w:rPr/>
+        <w:keepNext/>
+        <w:spacing w:before="200" w:after="120"/>
       </w:pPr>
       <w:r>
-        <w:rPr/>
-      </w:r>
-      <w:r>
-        <w:br w:type="page"/>
+        <w:rPr>
+          <w:rFonts w:ascii="Times New Roman" w:hAnsi="Times New Roman" w:eastAsia="Times New Roman"/>
+          <w:b/>
+          <w:color w:val="000000"/>
+          <w:sz w:val="26"/>
+        </w:rPr>
+        <w:t>7. Актуальные результаты тестирования</w:t>
       </w:r>
     </w:p>
     <w:p>
       <w:pPr>
-        <w:pStyle w:val="Normal"/>
-        <w:spacing w:before="0" w:after="0"/>
-        <w:ind w:hanging="0"/>
-        <w:jc w:val="left"/>
-        <w:rPr/>
+        <w:spacing w:after="120" w:line="276" w:lineRule="auto"/>
+        <w:jc w:val="both"/>
       </w:pPr>
       <w:r>
         <w:rPr>
-          <w:b/>
+          <w:rFonts w:ascii="Times New Roman" w:hAnsi="Times New Roman" w:eastAsia="Times New Roman"/>
+          <w:color w:val="000000"/>
+          <w:sz w:val="24"/>
         </w:rPr>
-        <w:t xml:space="preserve">11. </w:t>
+        <w:t>Команда python -m unittest discover -s tests -v обнаружила и выполнила 12 тестов. Все проверки завершились успешно: Ran 12 tests — OK.</w:t>
       </w:r>
+    </w:p>
+    <w:tbl>
+      <w:tblPr>
+        <w:tblStyle w:val="TableGrid"/>
+        <w:tblW w:type="auto" w:w="0"/>
+        <w:tblLook w:firstColumn="1" w:firstRow="1" w:lastColumn="0" w:lastRow="0" w:noHBand="0" w:noVBand="1" w:val="04A0"/>
+      </w:tblPr>
+      <w:tblGrid>
+        <w:gridCol w:w="2422"/>
+        <w:gridCol w:w="2422"/>
+        <w:gridCol w:w="2422"/>
+        <w:gridCol w:w="2422"/>
+      </w:tblGrid>
+      <w:tr>
+        <w:trPr>
+          <w:tblHeader/>
+        </w:trPr>
+        <w:tc>
+          <w:tcPr>
+            <w:tcW w:type="dxa" w:w="2422"/>
+            <w:vAlign w:val="center"/>
+            <w:tcMar>
+              <w:top w:w="100" w:type="dxa"/>
+              <w:left w:w="100" w:type="dxa"/>
+              <w:bottom w:w="100" w:type="dxa"/>
+              <w:right w:w="100" w:type="dxa"/>
+            </w:tcMar>
+            <w:shd w:fill="D9E2F3"/>
+          </w:tcPr>
+          <w:p>
+            <w:pPr>
+              <w:spacing w:after="0" w:line="240" w:lineRule="auto"/>
+              <w:jc w:val="center"/>
+            </w:pPr>
+            <w:r>
+              <w:rPr>
+                <w:rFonts w:ascii="Times New Roman" w:hAnsi="Times New Roman" w:eastAsia="Times New Roman"/>
+                <w:b/>
+                <w:color w:val="000000"/>
+                <w:sz w:val="20"/>
+              </w:rPr>
+              <w:t>Фигура</w:t>
+            </w:r>
+          </w:p>
+        </w:tc>
+        <w:tc>
+          <w:tcPr>
+            <w:tcW w:type="dxa" w:w="2422"/>
+            <w:vAlign w:val="center"/>
+            <w:tcMar>
+              <w:top w:w="100" w:type="dxa"/>
+              <w:left w:w="100" w:type="dxa"/>
+              <w:bottom w:w="100" w:type="dxa"/>
+              <w:right w:w="100" w:type="dxa"/>
+            </w:tcMar>
+            <w:shd w:fill="D9E2F3"/>
+          </w:tcPr>
+          <w:p>
+            <w:pPr>
+              <w:spacing w:after="0" w:line="240" w:lineRule="auto"/>
+              <w:jc w:val="left"/>
+            </w:pPr>
+            <w:r>
+              <w:rPr>
+                <w:rFonts w:ascii="Times New Roman" w:hAnsi="Times New Roman" w:eastAsia="Times New Roman"/>
+                <w:b/>
+                <w:color w:val="000000"/>
+                <w:sz w:val="20"/>
+              </w:rPr>
+              <w:t>Проверки</w:t>
+            </w:r>
+          </w:p>
+        </w:tc>
+        <w:tc>
+          <w:tcPr>
+            <w:tcW w:type="dxa" w:w="2422"/>
+            <w:vAlign w:val="center"/>
+            <w:tcMar>
+              <w:top w:w="100" w:type="dxa"/>
+              <w:left w:w="100" w:type="dxa"/>
+              <w:bottom w:w="100" w:type="dxa"/>
+              <w:right w:w="100" w:type="dxa"/>
+            </w:tcMar>
+            <w:shd w:fill="D9E2F3"/>
+          </w:tcPr>
+          <w:p>
+            <w:pPr>
+              <w:spacing w:after="0" w:line="240" w:lineRule="auto"/>
+              <w:jc w:val="center"/>
+            </w:pPr>
+            <w:r>
+              <w:rPr>
+                <w:rFonts w:ascii="Times New Roman" w:hAnsi="Times New Roman" w:eastAsia="Times New Roman"/>
+                <w:b/>
+                <w:color w:val="000000"/>
+                <w:sz w:val="20"/>
+              </w:rPr>
+              <w:t>Тестов</w:t>
+            </w:r>
+          </w:p>
+        </w:tc>
+        <w:tc>
+          <w:tcPr>
+            <w:tcW w:type="dxa" w:w="2422"/>
+            <w:vAlign w:val="center"/>
+            <w:tcMar>
+              <w:top w:w="100" w:type="dxa"/>
+              <w:left w:w="100" w:type="dxa"/>
+              <w:bottom w:w="100" w:type="dxa"/>
+              <w:right w:w="100" w:type="dxa"/>
+            </w:tcMar>
+            <w:shd w:fill="D9E2F3"/>
+          </w:tcPr>
+          <w:p>
+            <w:pPr>
+              <w:spacing w:after="0" w:line="240" w:lineRule="auto"/>
+              <w:jc w:val="center"/>
+            </w:pPr>
+            <w:r>
+              <w:rPr>
+                <w:rFonts w:ascii="Times New Roman" w:hAnsi="Times New Roman" w:eastAsia="Times New Roman"/>
+                <w:b/>
+                <w:color w:val="000000"/>
+                <w:sz w:val="20"/>
+              </w:rPr>
+              <w:t>Статус</w:t>
+            </w:r>
+          </w:p>
+        </w:tc>
+      </w:tr>
+      <w:tr>
+        <w:tc>
+          <w:tcPr>
+            <w:tcW w:type="dxa" w:w="2422"/>
+            <w:vAlign w:val="center"/>
+            <w:tcMar>
+              <w:top w:w="100" w:type="dxa"/>
+              <w:left w:w="100" w:type="dxa"/>
+              <w:bottom w:w="100" w:type="dxa"/>
+              <w:right w:w="100" w:type="dxa"/>
+            </w:tcMar>
+          </w:tcPr>
+          <w:p>
+            <w:pPr>
+              <w:spacing w:after="0" w:line="240" w:lineRule="auto"/>
+              <w:jc w:val="center"/>
+            </w:pPr>
+            <w:r>
+              <w:rPr>
+                <w:rFonts w:ascii="Times New Roman" w:hAnsi="Times New Roman" w:eastAsia="Times New Roman"/>
+                <w:b w:val="0"/>
+                <w:color w:val="000000"/>
+                <w:sz w:val="20"/>
+              </w:rPr>
+              <w:t>Круг</w:t>
+            </w:r>
+          </w:p>
+        </w:tc>
+        <w:tc>
+          <w:tcPr>
+            <w:tcW w:type="dxa" w:w="2422"/>
+            <w:vAlign w:val="center"/>
+            <w:tcMar>
+              <w:top w:w="100" w:type="dxa"/>
+              <w:left w:w="100" w:type="dxa"/>
+              <w:bottom w:w="100" w:type="dxa"/>
+              <w:right w:w="100" w:type="dxa"/>
+            </w:tcMar>
+          </w:tcPr>
+          <w:p>
+            <w:pPr>
+              <w:spacing w:after="0" w:line="240" w:lineRule="auto"/>
+              <w:jc w:val="left"/>
+            </w:pPr>
+            <w:r>
+              <w:rPr>
+                <w:rFonts w:ascii="Times New Roman" w:hAnsi="Times New Roman" w:eastAsia="Times New Roman"/>
+                <w:b w:val="0"/>
+                <w:color w:val="000000"/>
+                <w:sz w:val="20"/>
+              </w:rPr>
+              <w:t>area, perimeter, нулевой радиус</w:t>
+            </w:r>
+          </w:p>
+        </w:tc>
+        <w:tc>
+          <w:tcPr>
+            <w:tcW w:type="dxa" w:w="2422"/>
+            <w:vAlign w:val="center"/>
+            <w:tcMar>
+              <w:top w:w="100" w:type="dxa"/>
+              <w:left w:w="100" w:type="dxa"/>
+              <w:bottom w:w="100" w:type="dxa"/>
+              <w:right w:w="100" w:type="dxa"/>
+            </w:tcMar>
+          </w:tcPr>
+          <w:p>
+            <w:pPr>
+              <w:spacing w:after="0" w:line="240" w:lineRule="auto"/>
+              <w:jc w:val="center"/>
+            </w:pPr>
+            <w:r>
+              <w:rPr>
+                <w:rFonts w:ascii="Times New Roman" w:hAnsi="Times New Roman" w:eastAsia="Times New Roman"/>
+                <w:b w:val="0"/>
+                <w:color w:val="000000"/>
+                <w:sz w:val="20"/>
+              </w:rPr>
+              <w:t>3</w:t>
+            </w:r>
+          </w:p>
+        </w:tc>
+        <w:tc>
+          <w:tcPr>
+            <w:tcW w:type="dxa" w:w="2422"/>
+            <w:vAlign w:val="center"/>
+            <w:tcMar>
+              <w:top w:w="100" w:type="dxa"/>
+              <w:left w:w="100" w:type="dxa"/>
+              <w:bottom w:w="100" w:type="dxa"/>
+              <w:right w:w="100" w:type="dxa"/>
+            </w:tcMar>
+          </w:tcPr>
+          <w:p>
+            <w:pPr>
+              <w:spacing w:after="0" w:line="240" w:lineRule="auto"/>
+              <w:jc w:val="center"/>
+            </w:pPr>
+            <w:r>
+              <w:rPr>
+                <w:rFonts w:ascii="Times New Roman" w:hAnsi="Times New Roman" w:eastAsia="Times New Roman"/>
+                <w:b w:val="0"/>
+                <w:color w:val="000000"/>
+                <w:sz w:val="20"/>
+              </w:rPr>
+              <w:t>OK</w:t>
+            </w:r>
+          </w:p>
+        </w:tc>
+      </w:tr>
+      <w:tr>
+        <w:tc>
+          <w:tcPr>
+            <w:tcW w:type="dxa" w:w="2422"/>
+            <w:vAlign w:val="center"/>
+            <w:tcMar>
+              <w:top w:w="100" w:type="dxa"/>
+              <w:left w:w="100" w:type="dxa"/>
+              <w:bottom w:w="100" w:type="dxa"/>
+              <w:right w:w="100" w:type="dxa"/>
+            </w:tcMar>
+          </w:tcPr>
+          <w:p>
+            <w:pPr>
+              <w:spacing w:after="0" w:line="240" w:lineRule="auto"/>
+              <w:jc w:val="center"/>
+            </w:pPr>
+            <w:r>
+              <w:rPr>
+                <w:rFonts w:ascii="Times New Roman" w:hAnsi="Times New Roman" w:eastAsia="Times New Roman"/>
+                <w:b w:val="0"/>
+                <w:color w:val="000000"/>
+                <w:sz w:val="20"/>
+              </w:rPr>
+              <w:t>Прямоугольник</w:t>
+            </w:r>
+          </w:p>
+        </w:tc>
+        <w:tc>
+          <w:tcPr>
+            <w:tcW w:type="dxa" w:w="2422"/>
+            <w:vAlign w:val="center"/>
+            <w:tcMar>
+              <w:top w:w="100" w:type="dxa"/>
+              <w:left w:w="100" w:type="dxa"/>
+              <w:bottom w:w="100" w:type="dxa"/>
+              <w:right w:w="100" w:type="dxa"/>
+            </w:tcMar>
+          </w:tcPr>
+          <w:p>
+            <w:pPr>
+              <w:spacing w:after="0" w:line="240" w:lineRule="auto"/>
+              <w:jc w:val="left"/>
+            </w:pPr>
+            <w:r>
+              <w:rPr>
+                <w:rFonts w:ascii="Times New Roman" w:hAnsi="Times New Roman" w:eastAsia="Times New Roman"/>
+                <w:b w:val="0"/>
+                <w:color w:val="000000"/>
+                <w:sz w:val="20"/>
+              </w:rPr>
+              <w:t>area, perimeter, нулевая сторона</w:t>
+            </w:r>
+          </w:p>
+        </w:tc>
+        <w:tc>
+          <w:tcPr>
+            <w:tcW w:type="dxa" w:w="2422"/>
+            <w:vAlign w:val="center"/>
+            <w:tcMar>
+              <w:top w:w="100" w:type="dxa"/>
+              <w:left w:w="100" w:type="dxa"/>
+              <w:bottom w:w="100" w:type="dxa"/>
+              <w:right w:w="100" w:type="dxa"/>
+            </w:tcMar>
+          </w:tcPr>
+          <w:p>
+            <w:pPr>
+              <w:spacing w:after="0" w:line="240" w:lineRule="auto"/>
+              <w:jc w:val="center"/>
+            </w:pPr>
+            <w:r>
+              <w:rPr>
+                <w:rFonts w:ascii="Times New Roman" w:hAnsi="Times New Roman" w:eastAsia="Times New Roman"/>
+                <w:b w:val="0"/>
+                <w:color w:val="000000"/>
+                <w:sz w:val="20"/>
+              </w:rPr>
+              <w:t>3</w:t>
+            </w:r>
+          </w:p>
+        </w:tc>
+        <w:tc>
+          <w:tcPr>
+            <w:tcW w:type="dxa" w:w="2422"/>
+            <w:vAlign w:val="center"/>
+            <w:tcMar>
+              <w:top w:w="100" w:type="dxa"/>
+              <w:left w:w="100" w:type="dxa"/>
+              <w:bottom w:w="100" w:type="dxa"/>
+              <w:right w:w="100" w:type="dxa"/>
+            </w:tcMar>
+          </w:tcPr>
+          <w:p>
+            <w:pPr>
+              <w:spacing w:after="0" w:line="240" w:lineRule="auto"/>
+              <w:jc w:val="center"/>
+            </w:pPr>
+            <w:r>
+              <w:rPr>
+                <w:rFonts w:ascii="Times New Roman" w:hAnsi="Times New Roman" w:eastAsia="Times New Roman"/>
+                <w:b w:val="0"/>
+                <w:color w:val="000000"/>
+                <w:sz w:val="20"/>
+              </w:rPr>
+              <w:t>OK</w:t>
+            </w:r>
+          </w:p>
+        </w:tc>
+      </w:tr>
+      <w:tr>
+        <w:tc>
+          <w:tcPr>
+            <w:tcW w:type="dxa" w:w="2422"/>
+            <w:vAlign w:val="center"/>
+            <w:tcMar>
+              <w:top w:w="100" w:type="dxa"/>
+              <w:left w:w="100" w:type="dxa"/>
+              <w:bottom w:w="100" w:type="dxa"/>
+              <w:right w:w="100" w:type="dxa"/>
+            </w:tcMar>
+          </w:tcPr>
+          <w:p>
+            <w:pPr>
+              <w:spacing w:after="0" w:line="240" w:lineRule="auto"/>
+              <w:jc w:val="center"/>
+            </w:pPr>
+            <w:r>
+              <w:rPr>
+                <w:rFonts w:ascii="Times New Roman" w:hAnsi="Times New Roman" w:eastAsia="Times New Roman"/>
+                <w:b w:val="0"/>
+                <w:color w:val="000000"/>
+                <w:sz w:val="20"/>
+              </w:rPr>
+              <w:t>Квадрат</w:t>
+            </w:r>
+          </w:p>
+        </w:tc>
+        <w:tc>
+          <w:tcPr>
+            <w:tcW w:type="dxa" w:w="2422"/>
+            <w:vAlign w:val="center"/>
+            <w:tcMar>
+              <w:top w:w="100" w:type="dxa"/>
+              <w:left w:w="100" w:type="dxa"/>
+              <w:bottom w:w="100" w:type="dxa"/>
+              <w:right w:w="100" w:type="dxa"/>
+            </w:tcMar>
+          </w:tcPr>
+          <w:p>
+            <w:pPr>
+              <w:spacing w:after="0" w:line="240" w:lineRule="auto"/>
+              <w:jc w:val="left"/>
+            </w:pPr>
+            <w:r>
+              <w:rPr>
+                <w:rFonts w:ascii="Times New Roman" w:hAnsi="Times New Roman" w:eastAsia="Times New Roman"/>
+                <w:b w:val="0"/>
+                <w:color w:val="000000"/>
+                <w:sz w:val="20"/>
+              </w:rPr>
+              <w:t>area, perimeter, нулевая сторона</w:t>
+            </w:r>
+          </w:p>
+        </w:tc>
+        <w:tc>
+          <w:tcPr>
+            <w:tcW w:type="dxa" w:w="2422"/>
+            <w:vAlign w:val="center"/>
+            <w:tcMar>
+              <w:top w:w="100" w:type="dxa"/>
+              <w:left w:w="100" w:type="dxa"/>
+              <w:bottom w:w="100" w:type="dxa"/>
+              <w:right w:w="100" w:type="dxa"/>
+            </w:tcMar>
+          </w:tcPr>
+          <w:p>
+            <w:pPr>
+              <w:spacing w:after="0" w:line="240" w:lineRule="auto"/>
+              <w:jc w:val="center"/>
+            </w:pPr>
+            <w:r>
+              <w:rPr>
+                <w:rFonts w:ascii="Times New Roman" w:hAnsi="Times New Roman" w:eastAsia="Times New Roman"/>
+                <w:b w:val="0"/>
+                <w:color w:val="000000"/>
+                <w:sz w:val="20"/>
+              </w:rPr>
+              <w:t>3</w:t>
+            </w:r>
+          </w:p>
+        </w:tc>
+        <w:tc>
+          <w:tcPr>
+            <w:tcW w:type="dxa" w:w="2422"/>
+            <w:vAlign w:val="center"/>
+            <w:tcMar>
+              <w:top w:w="100" w:type="dxa"/>
+              <w:left w:w="100" w:type="dxa"/>
+              <w:bottom w:w="100" w:type="dxa"/>
+              <w:right w:w="100" w:type="dxa"/>
+            </w:tcMar>
+          </w:tcPr>
+          <w:p>
+            <w:pPr>
+              <w:spacing w:after="0" w:line="240" w:lineRule="auto"/>
+              <w:jc w:val="center"/>
+            </w:pPr>
+            <w:r>
+              <w:rPr>
+                <w:rFonts w:ascii="Times New Roman" w:hAnsi="Times New Roman" w:eastAsia="Times New Roman"/>
+                <w:b w:val="0"/>
+                <w:color w:val="000000"/>
+                <w:sz w:val="20"/>
+              </w:rPr>
+              <w:t>OK</w:t>
+            </w:r>
+          </w:p>
+        </w:tc>
+      </w:tr>
+      <w:tr>
+        <w:tc>
+          <w:tcPr>
+            <w:tcW w:type="dxa" w:w="2422"/>
+            <w:vAlign w:val="center"/>
+            <w:tcMar>
+              <w:top w:w="100" w:type="dxa"/>
+              <w:left w:w="100" w:type="dxa"/>
+              <w:bottom w:w="100" w:type="dxa"/>
+              <w:right w:w="100" w:type="dxa"/>
+            </w:tcMar>
+          </w:tcPr>
+          <w:p>
+            <w:pPr>
+              <w:spacing w:after="0" w:line="240" w:lineRule="auto"/>
+              <w:jc w:val="center"/>
+            </w:pPr>
+            <w:r>
+              <w:rPr>
+                <w:rFonts w:ascii="Times New Roman" w:hAnsi="Times New Roman" w:eastAsia="Times New Roman"/>
+                <w:b w:val="0"/>
+                <w:color w:val="000000"/>
+                <w:sz w:val="20"/>
+              </w:rPr>
+              <w:t>Треугольник</w:t>
+            </w:r>
+          </w:p>
+        </w:tc>
+        <w:tc>
+          <w:tcPr>
+            <w:tcW w:type="dxa" w:w="2422"/>
+            <w:vAlign w:val="center"/>
+            <w:tcMar>
+              <w:top w:w="100" w:type="dxa"/>
+              <w:left w:w="100" w:type="dxa"/>
+              <w:bottom w:w="100" w:type="dxa"/>
+              <w:right w:w="100" w:type="dxa"/>
+            </w:tcMar>
+          </w:tcPr>
+          <w:p>
+            <w:pPr>
+              <w:spacing w:after="0" w:line="240" w:lineRule="auto"/>
+              <w:jc w:val="left"/>
+            </w:pPr>
+            <w:r>
+              <w:rPr>
+                <w:rFonts w:ascii="Times New Roman" w:hAnsi="Times New Roman" w:eastAsia="Times New Roman"/>
+                <w:b w:val="0"/>
+                <w:color w:val="000000"/>
+                <w:sz w:val="20"/>
+              </w:rPr>
+              <w:t>area, perimeter, нулевая высота</w:t>
+            </w:r>
+          </w:p>
+        </w:tc>
+        <w:tc>
+          <w:tcPr>
+            <w:tcW w:type="dxa" w:w="2422"/>
+            <w:vAlign w:val="center"/>
+            <w:tcMar>
+              <w:top w:w="100" w:type="dxa"/>
+              <w:left w:w="100" w:type="dxa"/>
+              <w:bottom w:w="100" w:type="dxa"/>
+              <w:right w:w="100" w:type="dxa"/>
+            </w:tcMar>
+          </w:tcPr>
+          <w:p>
+            <w:pPr>
+              <w:spacing w:after="0" w:line="240" w:lineRule="auto"/>
+              <w:jc w:val="center"/>
+            </w:pPr>
+            <w:r>
+              <w:rPr>
+                <w:rFonts w:ascii="Times New Roman" w:hAnsi="Times New Roman" w:eastAsia="Times New Roman"/>
+                <w:b w:val="0"/>
+                <w:color w:val="000000"/>
+                <w:sz w:val="20"/>
+              </w:rPr>
+              <w:t>3</w:t>
+            </w:r>
+          </w:p>
+        </w:tc>
+        <w:tc>
+          <w:tcPr>
+            <w:tcW w:type="dxa" w:w="2422"/>
+            <w:vAlign w:val="center"/>
+            <w:tcMar>
+              <w:top w:w="100" w:type="dxa"/>
+              <w:left w:w="100" w:type="dxa"/>
+              <w:bottom w:w="100" w:type="dxa"/>
+              <w:right w:w="100" w:type="dxa"/>
+            </w:tcMar>
+          </w:tcPr>
+          <w:p>
+            <w:pPr>
+              <w:spacing w:after="0" w:line="240" w:lineRule="auto"/>
+              <w:jc w:val="center"/>
+            </w:pPr>
+            <w:r>
+              <w:rPr>
+                <w:rFonts w:ascii="Times New Roman" w:hAnsi="Times New Roman" w:eastAsia="Times New Roman"/>
+                <w:b w:val="0"/>
+                <w:color w:val="000000"/>
+                <w:sz w:val="20"/>
+              </w:rPr>
+              <w:t>OK</w:t>
+            </w:r>
+          </w:p>
+        </w:tc>
+      </w:tr>
+    </w:tbl>
+    <w:p>
+      <w:pPr>
+        <w:spacing w:before="160" w:after="120"/>
+      </w:pPr>
       <w:r>
         <w:rPr>
-          <w:b w:val="false"/>
-          <w:bCs w:val="false"/>
+          <w:rFonts w:ascii="Times New Roman" w:hAnsi="Times New Roman" w:eastAsia="Times New Roman"/>
+          <w:b/>
+          <w:color w:val="000000"/>
+          <w:sz w:val="24"/>
         </w:rPr>
-        <w:t>Удалил ветку new_features-558418, для этого я предварительно переключился на ветку main.</w:t>
+        <w:t>Итоговый вывод unittest:</w:t>
       </w:r>
     </w:p>
     <w:p>
       <w:pPr>
-        <w:pStyle w:val="Normal"/>
-        <w:spacing w:before="0" w:after="0"/>
-        <w:ind w:firstLine="709"/>
-        <w:jc w:val="both"/>
-        <w:rPr/>
+        <w:spacing w:after="160" w:line="240" w:lineRule="auto"/>
+        <w:ind w:left="360"/>
       </w:pPr>
       <w:r>
-        <w:rPr/>
-        <w:drawing>
-          <wp:anchor behindDoc="0" distT="0" distB="0" distL="0" distR="0" simplePos="0" locked="0" layoutInCell="0" allowOverlap="1" relativeHeight="13">
-            <wp:simplePos x="0" y="0"/>
-            <wp:positionH relativeFrom="column">
-              <wp:posOffset>17780</wp:posOffset>
-            </wp:positionH>
-            <wp:positionV relativeFrom="paragraph">
-              <wp:posOffset>-59690</wp:posOffset>
-            </wp:positionV>
-            <wp:extent cx="6152515" cy="2068195"/>
-            <wp:effectExtent l="0" t="0" r="0" b="0"/>
-            <wp:wrapSquare wrapText="largest"/>
-            <wp:docPr id="13" name="Image11" descr=""/>
-            <wp:cNvGraphicFramePr>
-              <a:graphicFrameLocks xmlns:a="http://schemas.openxmlformats.org/drawingml/2006/main" noChangeAspect="1"/>
-            </wp:cNvGraphicFramePr>
-            <a:graphic xmlns:a="http://schemas.openxmlformats.org/drawingml/2006/main">
-              <a:graphicData uri="http://schemas.openxmlformats.org/drawingml/2006/picture">
-                <pic:pic xmlns:pic="http://schemas.openxmlformats.org/drawingml/2006/picture">
-                  <pic:nvPicPr>
-                    <pic:cNvPr id="13" name="Image11" descr=""/>
-                    <pic:cNvPicPr>
-                      <a:picLocks noChangeAspect="1" noChangeArrowheads="1"/>
-                    </pic:cNvPicPr>
-                  </pic:nvPicPr>
-                  <pic:blipFill>
-                    <a:blip r:embed="rId14"/>
-                    <a:stretch>
-                      <a:fillRect/>
-                    </a:stretch>
-                  </pic:blipFill>
-                  <pic:spPr bwMode="auto">
-                    <a:xfrm>
-                      <a:off x="0" y="0"/>
-                      <a:ext cx="6152515" cy="2068195"/>
-                    </a:xfrm>
-                    <a:prstGeom prst="rect">
-                      <a:avLst/>
-                    </a:prstGeom>
-                    <a:noFill/>
-                  </pic:spPr>
-                </pic:pic>
-              </a:graphicData>
-            </a:graphic>
-          </wp:anchor>
-        </w:drawing>
+        <w:rPr>
+          <w:rFonts w:ascii="Courier New" w:hAnsi="Courier New" w:eastAsia="Courier New"/>
+          <w:color w:val="000000"/>
+          <w:sz w:val="20"/>
+        </w:rPr>
+        <w:t>Ran 12 tests in 0.000s</w:t>
+        <w:br/>
+        <w:br/>
+        <w:t>OK</w:t>
       </w:r>
     </w:p>
     <w:p>
       <w:pPr>
-        <w:pStyle w:val="Normal"/>
-        <w:spacing w:before="0" w:after="0"/>
-        <w:ind w:hanging="0" w:left="0"/>
-        <w:jc w:val="both"/>
-        <w:rPr>
-          <w:b/>
-          <w:bCs/>
-        </w:rPr>
+        <w:keepNext/>
+        <w:spacing w:before="200" w:after="120"/>
       </w:pPr>
       <w:r>
         <w:rPr>
+          <w:rFonts w:ascii="Times New Roman" w:hAnsi="Times New Roman" w:eastAsia="Times New Roman"/>
           <w:b/>
-          <w:bCs/>
+          <w:color w:val="000000"/>
+          <w:sz w:val="26"/>
         </w:rPr>
-        <w:t xml:space="preserve">12*. </w:t>
-      </w:r>
-      <w:r>
-        <w:rPr>
-          <w:b w:val="false"/>
-          <w:bCs w:val="false"/>
-        </w:rPr>
-        <w:t xml:space="preserve">Перед тем как удалять ветку new_features-558418 я создал github репозиторий </w:t>
-      </w:r>
-      <w:hyperlink r:id="rId15">
-        <w:r>
-          <w:rPr>
-            <w:rStyle w:val="Hyperlink"/>
-            <w:b w:val="false"/>
-            <w:bCs w:val="false"/>
-          </w:rPr>
-          <w:t>https://github.com/OMNIlos/isrpo-lab-01.git</w:t>
-        </w:r>
-      </w:hyperlink>
-      <w:r>
-        <w:rPr>
-          <w:b w:val="false"/>
-          <w:bCs w:val="false"/>
-        </w:rPr>
-        <w:t xml:space="preserve"> в котором я опубликовал работу. Для этого я создал personal ссылку на созданные репозиторий (remote) так как изначальный origin был </w:t>
-      </w:r>
-      <w:hyperlink r:id="rId16">
-        <w:r>
-          <w:rPr>
-            <w:rStyle w:val="Hyperlink"/>
-            <w:b w:val="false"/>
-            <w:bCs w:val="false"/>
-          </w:rPr>
-          <w:t>https://github.com/smartiqaorg/geometric_lib.git</w:t>
-        </w:r>
-      </w:hyperlink>
-      <w:r>
-        <w:rPr>
-          <w:b w:val="false"/>
-          <w:bCs w:val="false"/>
-        </w:rPr>
-        <w:t xml:space="preserve"> </w:t>
+        <w:t>8. Выводы из результатов тестирования</w:t>
       </w:r>
     </w:p>
     <w:p>
       <w:pPr>
-        <w:pStyle w:val="Normal"/>
-        <w:spacing w:before="0" w:after="0"/>
-        <w:ind w:hanging="0" w:left="0"/>
+        <w:spacing w:after="120" w:line="276" w:lineRule="auto"/>
         <w:jc w:val="both"/>
-        <w:rPr/>
-      </w:pPr>
-      <w:r>
-        <w:drawing>
-          <wp:anchor behindDoc="0" distT="0" distB="0" distL="0" distR="0" simplePos="0" locked="0" layoutInCell="0" allowOverlap="1" relativeHeight="14">
-            <wp:simplePos x="0" y="0"/>
-            <wp:positionH relativeFrom="column">
-              <wp:align>center</wp:align>
-            </wp:positionH>
-            <wp:positionV relativeFrom="paragraph">
-              <wp:posOffset>635</wp:posOffset>
-            </wp:positionV>
-            <wp:extent cx="6152515" cy="1746885"/>
-            <wp:effectExtent l="0" t="0" r="0" b="0"/>
-            <wp:wrapSquare wrapText="largest"/>
-            <wp:docPr id="14" name="Image12" descr=""/>
-            <wp:cNvGraphicFramePr>
-              <a:graphicFrameLocks xmlns:a="http://schemas.openxmlformats.org/drawingml/2006/main" noChangeAspect="1"/>
-            </wp:cNvGraphicFramePr>
-            <a:graphic xmlns:a="http://schemas.openxmlformats.org/drawingml/2006/main">
-              <a:graphicData uri="http://schemas.openxmlformats.org/drawingml/2006/picture">
-                <pic:pic xmlns:pic="http://schemas.openxmlformats.org/drawingml/2006/picture">
-                  <pic:nvPicPr>
-                    <pic:cNvPr id="14" name="Image12" descr=""/>
-                    <pic:cNvPicPr>
-                      <a:picLocks noChangeAspect="1" noChangeArrowheads="1"/>
-                    </pic:cNvPicPr>
-                  </pic:nvPicPr>
-                  <pic:blipFill>
-                    <a:blip r:embed="rId17"/>
-                    <a:stretch>
-                      <a:fillRect/>
-                    </a:stretch>
-                  </pic:blipFill>
-                  <pic:spPr bwMode="auto">
-                    <a:xfrm>
-                      <a:off x="0" y="0"/>
-                      <a:ext cx="6152515" cy="1746885"/>
-                    </a:xfrm>
-                    <a:prstGeom prst="rect">
-                      <a:avLst/>
-                    </a:prstGeom>
-                    <a:noFill/>
-                  </pic:spPr>
-                </pic:pic>
-              </a:graphicData>
-            </a:graphic>
-          </wp:anchor>
-        </w:drawing>
-      </w:r>
-      <w:r>
-        <w:rPr/>
-        <w:t>На скриншоте видная моя ошибка при первой попытке подсоежинения созданного мною github репозитория, я попытался подвязать его как origin, но как говорилось ранее origin уже существует.</w:t>
-      </w:r>
-    </w:p>
-    <w:p>
-      <w:pPr>
-        <w:pStyle w:val="Normal"/>
-        <w:spacing w:before="0" w:after="0"/>
-        <w:ind w:hanging="0" w:left="0"/>
-        <w:jc w:val="both"/>
-        <w:rPr/>
-      </w:pPr>
-      <w:r>
-        <w:rPr/>
-      </w:r>
-    </w:p>
-    <w:p>
-      <w:pPr>
-        <w:pStyle w:val="Normal"/>
-        <w:spacing w:before="0" w:after="0"/>
-        <w:ind w:hanging="0" w:left="0"/>
-        <w:jc w:val="both"/>
-        <w:rPr/>
       </w:pPr>
       <w:r>
         <w:rPr>
-          <w:b/>
-          <w:bCs/>
+          <w:rFonts w:ascii="Times New Roman" w:hAnsi="Times New Roman" w:eastAsia="Times New Roman"/>
+          <w:color w:val="000000"/>
+          <w:sz w:val="24"/>
         </w:rPr>
-        <w:t>13.</w:t>
-      </w:r>
-      <w:r>
-        <w:rPr/>
-        <w:t xml:space="preserve"> Вывод.</w:t>
-      </w:r>
-    </w:p>
-    <w:p>
-      <w:pPr>
-        <w:pStyle w:val="Normal"/>
-        <w:spacing w:before="0" w:after="0"/>
-        <w:ind w:hanging="0" w:left="0"/>
-        <w:jc w:val="both"/>
-        <w:rPr/>
-      </w:pPr>
-      <w:r>
-        <w:rPr/>
-        <w:t>Научился работать с распределенной системой контроля версий git, а именно:</w:t>
-      </w:r>
-    </w:p>
-    <w:p>
-      <w:pPr>
-        <w:pStyle w:val="Normal"/>
-        <w:spacing w:before="0" w:after="0"/>
-        <w:ind w:hanging="0" w:left="0"/>
-        <w:jc w:val="both"/>
-        <w:rPr/>
-      </w:pPr>
-      <w:r>
-        <w:rPr/>
-        <w:t>- Клонировать удаленный репозиторий с GitHub.</w:t>
-      </w:r>
-    </w:p>
-    <w:p>
-      <w:pPr>
-        <w:pStyle w:val="Normal"/>
-        <w:spacing w:before="0" w:after="0"/>
-        <w:ind w:hanging="0" w:left="0"/>
-        <w:jc w:val="both"/>
-        <w:rPr/>
-      </w:pPr>
-      <w:r>
-        <w:rPr/>
-        <w:t>- Создавать отдельную ветку и работать в ней</w:t>
-      </w:r>
-    </w:p>
-    <w:p>
-      <w:pPr>
-        <w:pStyle w:val="Normal"/>
-        <w:spacing w:before="0" w:after="0"/>
-        <w:ind w:hanging="0" w:left="0"/>
-        <w:jc w:val="both"/>
-        <w:rPr/>
-      </w:pPr>
-      <w:r>
-        <w:rPr/>
-        <w:t>- Анализировать разницу между коммитами</w:t>
-      </w:r>
-    </w:p>
-    <w:p>
-      <w:pPr>
-        <w:pStyle w:val="Normal"/>
-        <w:spacing w:before="0" w:after="0"/>
-        <w:ind w:hanging="0" w:left="0"/>
-        <w:jc w:val="both"/>
-        <w:rPr/>
-      </w:pPr>
-      <w:r>
-        <w:rPr/>
-        <w:t>- Строить графы истории</w:t>
-      </w:r>
-    </w:p>
-    <w:p>
-      <w:pPr>
-        <w:pStyle w:val="Normal"/>
-        <w:spacing w:before="0" w:after="0"/>
-        <w:ind w:hanging="0" w:left="0"/>
-        <w:jc w:val="both"/>
-        <w:rPr/>
-      </w:pPr>
-      <w:r>
-        <w:rPr/>
+        <w:t>Все функции приложения работают в соответствии с используемыми формулами на подготовленных наборах данных. Тестами покрыты все четыре фигуры и обе операции каждого модуля. Дефекты в проверенных сценариях не обнаружены. Исходный код тестов размещён в каталоге tests, а результат добавления тестов фиксируется в истории Git репозитория.</w:t>
       </w:r>
     </w:p>
     <w:sectPr>

</xml_diff>

<commit_message>
Simplify laboratory report formatting
</commit_message>
<xml_diff>
--- a/lab_report.docx
+++ b/lab_report.docx
@@ -542,795 +542,9 @@
     <w:p>
       <w:pPr>
         <w:pageBreakBefore/>
-        <w:spacing w:after="160"/>
-        <w:jc w:val="center"/>
-      </w:pPr>
-      <w:r>
-        <w:rPr>
-          <w:rFonts w:ascii="Times New Roman" w:hAnsi="Times New Roman" w:eastAsia="Times New Roman"/>
-          <w:b/>
-          <w:color w:val="000000"/>
-          <w:sz w:val="28"/>
-        </w:rPr>
-        <w:t>План и результаты модульного тестирования</w:t>
-      </w:r>
-    </w:p>
-    <w:p>
-      <w:pPr>
-        <w:keepNext/>
-        <w:spacing w:before="200" w:after="120"/>
-      </w:pPr>
-      <w:r>
-        <w:rPr>
-          <w:rFonts w:ascii="Times New Roman" w:hAnsi="Times New Roman" w:eastAsia="Times New Roman"/>
-          <w:b/>
-          <w:color w:val="000000"/>
-          <w:sz w:val="26"/>
-        </w:rPr>
-        <w:t>1. Цели и задачи тестирования</w:t>
-      </w:r>
-    </w:p>
-    <w:p>
-      <w:pPr>
-        <w:spacing w:after="120" w:line="276" w:lineRule="auto"/>
-        <w:jc w:val="both"/>
-      </w:pPr>
-      <w:r>
-        <w:rPr>
-          <w:rFonts w:ascii="Times New Roman" w:hAnsi="Times New Roman" w:eastAsia="Times New Roman"/>
-          <w:color w:val="000000"/>
-          <w:sz w:val="24"/>
-        </w:rPr>
-        <w:t>Цель работы — проверить корректность вычисления площади и периметра четырёх геометрических фигур. Задачи тестирования: подготовить независимые unit-тесты, сравнить результаты функций с заранее рассчитанными значениями и зафиксировать результат автоматического запуска.</w:t>
-      </w:r>
-    </w:p>
-    <w:p>
-      <w:pPr>
-        <w:keepNext/>
-        <w:spacing w:before="200" w:after="120"/>
-      </w:pPr>
-      <w:r>
-        <w:rPr>
-          <w:rFonts w:ascii="Times New Roman" w:hAnsi="Times New Roman" w:eastAsia="Times New Roman"/>
-          <w:b/>
-          <w:color w:val="000000"/>
-          <w:sz w:val="26"/>
-        </w:rPr>
-        <w:t>2. Описание тестируемого продукта</w:t>
-      </w:r>
-    </w:p>
-    <w:p>
-      <w:pPr>
-        <w:spacing w:after="120" w:line="276" w:lineRule="auto"/>
-        <w:jc w:val="both"/>
-      </w:pPr>
-      <w:r>
-        <w:rPr>
-          <w:rFonts w:ascii="Times New Roman" w:hAnsi="Times New Roman" w:eastAsia="Times New Roman"/>
-          <w:color w:val="000000"/>
-          <w:sz w:val="24"/>
-        </w:rPr>
-        <w:t>Тестируется Python-приложение из четырёх модулей: circle, rectangle, square и triangle. Каждый модуль содержит функции area и perimeter. Функции принимают числовые размеры фигуры и возвращают результат вычисления по стандартной геометрической формуле. Проверка допустимости входных данных приложением не выполняется.</w:t>
-      </w:r>
-    </w:p>
-    <w:p>
-      <w:pPr>
-        <w:keepNext/>
-        <w:spacing w:before="200" w:after="120"/>
-      </w:pPr>
-      <w:r>
-        <w:rPr>
-          <w:rFonts w:ascii="Times New Roman" w:hAnsi="Times New Roman" w:eastAsia="Times New Roman"/>
-          <w:b/>
-          <w:color w:val="000000"/>
-          <w:sz w:val="26"/>
-        </w:rPr>
-        <w:t>3. Область тестирования</w:t>
-      </w:r>
-    </w:p>
-    <w:p>
-      <w:pPr>
-        <w:spacing w:after="120" w:line="276" w:lineRule="auto"/>
-        <w:jc w:val="both"/>
-      </w:pPr>
-      <w:r>
-        <w:rPr>
-          <w:rFonts w:ascii="Times New Roman" w:hAnsi="Times New Roman" w:eastAsia="Times New Roman"/>
-          <w:color w:val="000000"/>
-          <w:sz w:val="24"/>
-        </w:rPr>
-        <w:t>В область тестирования входят восемь функций: площадь и периметр круга, прямоугольника, квадрата и треугольника. Проверяются целые и дробные значения, а также граничный случай с нулевым размером. Внешние интерфейсы, производительность и безопасность не рассматриваются.</w:t>
-      </w:r>
-    </w:p>
-    <w:p>
-      <w:pPr>
-        <w:keepNext/>
-        <w:spacing w:before="200" w:after="120"/>
-      </w:pPr>
-      <w:r>
-        <w:rPr>
-          <w:rFonts w:ascii="Times New Roman" w:hAnsi="Times New Roman" w:eastAsia="Times New Roman"/>
-          <w:b/>
-          <w:color w:val="000000"/>
-          <w:sz w:val="26"/>
-        </w:rPr>
-        <w:t>4. Стратегия тестирования</w:t>
-      </w:r>
-    </w:p>
-    <w:p>
-      <w:pPr>
-        <w:spacing w:after="120" w:line="276" w:lineRule="auto"/>
-        <w:jc w:val="both"/>
-      </w:pPr>
-      <w:r>
-        <w:rPr>
-          <w:rFonts w:ascii="Times New Roman" w:hAnsi="Times New Roman" w:eastAsia="Times New Roman"/>
-          <w:color w:val="000000"/>
-          <w:sz w:val="24"/>
-        </w:rPr>
-        <w:t>Используется функциональное модульное тестирование средствами стандартной библиотеки unittest. Тесты оформлены в классах, унаследованных от unittest.TestCase, и запускаются командой python -m unittest discover -s tests -v. Для точных результатов применяется assertEqual, для вычислений с числом π — assertAlmostEqual.</w:t>
-      </w:r>
-    </w:p>
-    <w:p>
-      <w:pPr>
-        <w:keepNext/>
-        <w:spacing w:before="200" w:after="120"/>
-      </w:pPr>
-      <w:r>
-        <w:rPr>
-          <w:rFonts w:ascii="Times New Roman" w:hAnsi="Times New Roman" w:eastAsia="Times New Roman"/>
-          <w:b/>
-          <w:color w:val="000000"/>
-          <w:sz w:val="26"/>
-        </w:rPr>
-        <w:t>5. Критерии приёмки</w:t>
-      </w:r>
-    </w:p>
-    <w:p>
-      <w:pPr>
-        <w:spacing w:after="120" w:line="276" w:lineRule="auto"/>
-        <w:jc w:val="both"/>
-      </w:pPr>
-      <w:r>
-        <w:rPr>
-          <w:rFonts w:ascii="Times New Roman" w:hAnsi="Times New Roman" w:eastAsia="Times New Roman"/>
-          <w:color w:val="000000"/>
-          <w:sz w:val="24"/>
-        </w:rPr>
-        <w:t>Работа считается принятой, если unittest обнаруживает тесты всех четырёх фигур, каждая функция area и perimeter проверена хотя бы одним тестом, все тесты завершаются со статусом OK, а модули приложения импортируются без ошибок.</w:t>
-      </w:r>
-    </w:p>
-    <w:p>
-      <w:pPr>
-        <w:keepNext/>
-        <w:spacing w:before="200" w:after="120"/>
-      </w:pPr>
-      <w:r>
-        <w:rPr>
-          <w:rFonts w:ascii="Times New Roman" w:hAnsi="Times New Roman" w:eastAsia="Times New Roman"/>
-          <w:b/>
-          <w:color w:val="000000"/>
-          <w:sz w:val="26"/>
-        </w:rPr>
-        <w:t>6. Ожидаемые результаты</w:t>
-      </w:r>
-    </w:p>
-    <w:p>
-      <w:pPr>
-        <w:spacing w:after="120" w:line="276" w:lineRule="auto"/>
-        <w:jc w:val="both"/>
-      </w:pPr>
-      <w:r>
-        <w:rPr>
-          <w:rFonts w:ascii="Times New Roman" w:hAnsi="Times New Roman" w:eastAsia="Times New Roman"/>
-          <w:color w:val="000000"/>
-          <w:sz w:val="24"/>
-        </w:rPr>
-        <w:t>Ожидается успешное выполнение 12 тестов. Для каждого набора входных данных результат функции должен совпасть с рассчитанным значением. При несовпадении unittest должен вывести имя проваленного теста и описание ошибки сравнения.</w:t>
-      </w:r>
-    </w:p>
-    <w:p>
-      <w:pPr>
-        <w:keepNext/>
-        <w:spacing w:before="200" w:after="120"/>
-      </w:pPr>
-      <w:r>
-        <w:rPr>
-          <w:rFonts w:ascii="Times New Roman" w:hAnsi="Times New Roman" w:eastAsia="Times New Roman"/>
-          <w:b/>
-          <w:color w:val="000000"/>
-          <w:sz w:val="26"/>
-        </w:rPr>
-        <w:t>7. Актуальные результаты тестирования</w:t>
-      </w:r>
-    </w:p>
-    <w:p>
-      <w:pPr>
-        <w:spacing w:after="120" w:line="276" w:lineRule="auto"/>
-        <w:jc w:val="both"/>
-      </w:pPr>
-      <w:r>
-        <w:rPr>
-          <w:rFonts w:ascii="Times New Roman" w:hAnsi="Times New Roman" w:eastAsia="Times New Roman"/>
-          <w:color w:val="000000"/>
-          <w:sz w:val="24"/>
-        </w:rPr>
-        <w:t>Команда python -m unittest discover -s tests -v обнаружила и выполнила 12 тестов. Все проверки завершились успешно: Ran 12 tests — OK.</w:t>
-      </w:r>
-    </w:p>
-    <w:tbl>
-      <w:tblPr>
-        <w:tblStyle w:val="TableGrid"/>
-        <w:tblW w:type="auto" w:w="0"/>
-        <w:tblLook w:firstColumn="1" w:firstRow="1" w:lastColumn="0" w:lastRow="0" w:noHBand="0" w:noVBand="1" w:val="04A0"/>
-      </w:tblPr>
-      <w:tblGrid>
-        <w:gridCol w:w="2422"/>
-        <w:gridCol w:w="2422"/>
-        <w:gridCol w:w="2422"/>
-        <w:gridCol w:w="2422"/>
-      </w:tblGrid>
-      <w:tr>
-        <w:trPr>
-          <w:tblHeader/>
-        </w:trPr>
-        <w:tc>
-          <w:tcPr>
-            <w:tcW w:type="dxa" w:w="2422"/>
-            <w:vAlign w:val="center"/>
-            <w:tcMar>
-              <w:top w:w="100" w:type="dxa"/>
-              <w:left w:w="100" w:type="dxa"/>
-              <w:bottom w:w="100" w:type="dxa"/>
-              <w:right w:w="100" w:type="dxa"/>
-            </w:tcMar>
-            <w:shd w:fill="D9E2F3"/>
-          </w:tcPr>
-          <w:p>
-            <w:pPr>
-              <w:spacing w:after="0" w:line="240" w:lineRule="auto"/>
-              <w:jc w:val="center"/>
-            </w:pPr>
-            <w:r>
-              <w:rPr>
-                <w:rFonts w:ascii="Times New Roman" w:hAnsi="Times New Roman" w:eastAsia="Times New Roman"/>
-                <w:b/>
-                <w:color w:val="000000"/>
-                <w:sz w:val="20"/>
-              </w:rPr>
-              <w:t>Фигура</w:t>
-            </w:r>
-          </w:p>
-        </w:tc>
-        <w:tc>
-          <w:tcPr>
-            <w:tcW w:type="dxa" w:w="2422"/>
-            <w:vAlign w:val="center"/>
-            <w:tcMar>
-              <w:top w:w="100" w:type="dxa"/>
-              <w:left w:w="100" w:type="dxa"/>
-              <w:bottom w:w="100" w:type="dxa"/>
-              <w:right w:w="100" w:type="dxa"/>
-            </w:tcMar>
-            <w:shd w:fill="D9E2F3"/>
-          </w:tcPr>
-          <w:p>
-            <w:pPr>
-              <w:spacing w:after="0" w:line="240" w:lineRule="auto"/>
-              <w:jc w:val="left"/>
-            </w:pPr>
-            <w:r>
-              <w:rPr>
-                <w:rFonts w:ascii="Times New Roman" w:hAnsi="Times New Roman" w:eastAsia="Times New Roman"/>
-                <w:b/>
-                <w:color w:val="000000"/>
-                <w:sz w:val="20"/>
-              </w:rPr>
-              <w:t>Проверки</w:t>
-            </w:r>
-          </w:p>
-        </w:tc>
-        <w:tc>
-          <w:tcPr>
-            <w:tcW w:type="dxa" w:w="2422"/>
-            <w:vAlign w:val="center"/>
-            <w:tcMar>
-              <w:top w:w="100" w:type="dxa"/>
-              <w:left w:w="100" w:type="dxa"/>
-              <w:bottom w:w="100" w:type="dxa"/>
-              <w:right w:w="100" w:type="dxa"/>
-            </w:tcMar>
-            <w:shd w:fill="D9E2F3"/>
-          </w:tcPr>
-          <w:p>
-            <w:pPr>
-              <w:spacing w:after="0" w:line="240" w:lineRule="auto"/>
-              <w:jc w:val="center"/>
-            </w:pPr>
-            <w:r>
-              <w:rPr>
-                <w:rFonts w:ascii="Times New Roman" w:hAnsi="Times New Roman" w:eastAsia="Times New Roman"/>
-                <w:b/>
-                <w:color w:val="000000"/>
-                <w:sz w:val="20"/>
-              </w:rPr>
-              <w:t>Тестов</w:t>
-            </w:r>
-          </w:p>
-        </w:tc>
-        <w:tc>
-          <w:tcPr>
-            <w:tcW w:type="dxa" w:w="2422"/>
-            <w:vAlign w:val="center"/>
-            <w:tcMar>
-              <w:top w:w="100" w:type="dxa"/>
-              <w:left w:w="100" w:type="dxa"/>
-              <w:bottom w:w="100" w:type="dxa"/>
-              <w:right w:w="100" w:type="dxa"/>
-            </w:tcMar>
-            <w:shd w:fill="D9E2F3"/>
-          </w:tcPr>
-          <w:p>
-            <w:pPr>
-              <w:spacing w:after="0" w:line="240" w:lineRule="auto"/>
-              <w:jc w:val="center"/>
-            </w:pPr>
-            <w:r>
-              <w:rPr>
-                <w:rFonts w:ascii="Times New Roman" w:hAnsi="Times New Roman" w:eastAsia="Times New Roman"/>
-                <w:b/>
-                <w:color w:val="000000"/>
-                <w:sz w:val="20"/>
-              </w:rPr>
-              <w:t>Статус</w:t>
-            </w:r>
-          </w:p>
-        </w:tc>
-      </w:tr>
-      <w:tr>
-        <w:tc>
-          <w:tcPr>
-            <w:tcW w:type="dxa" w:w="2422"/>
-            <w:vAlign w:val="center"/>
-            <w:tcMar>
-              <w:top w:w="100" w:type="dxa"/>
-              <w:left w:w="100" w:type="dxa"/>
-              <w:bottom w:w="100" w:type="dxa"/>
-              <w:right w:w="100" w:type="dxa"/>
-            </w:tcMar>
-          </w:tcPr>
-          <w:p>
-            <w:pPr>
-              <w:spacing w:after="0" w:line="240" w:lineRule="auto"/>
-              <w:jc w:val="center"/>
-            </w:pPr>
-            <w:r>
-              <w:rPr>
-                <w:rFonts w:ascii="Times New Roman" w:hAnsi="Times New Roman" w:eastAsia="Times New Roman"/>
-                <w:b w:val="0"/>
-                <w:color w:val="000000"/>
-                <w:sz w:val="20"/>
-              </w:rPr>
-              <w:t>Круг</w:t>
-            </w:r>
-          </w:p>
-        </w:tc>
-        <w:tc>
-          <w:tcPr>
-            <w:tcW w:type="dxa" w:w="2422"/>
-            <w:vAlign w:val="center"/>
-            <w:tcMar>
-              <w:top w:w="100" w:type="dxa"/>
-              <w:left w:w="100" w:type="dxa"/>
-              <w:bottom w:w="100" w:type="dxa"/>
-              <w:right w:w="100" w:type="dxa"/>
-            </w:tcMar>
-          </w:tcPr>
-          <w:p>
-            <w:pPr>
-              <w:spacing w:after="0" w:line="240" w:lineRule="auto"/>
-              <w:jc w:val="left"/>
-            </w:pPr>
-            <w:r>
-              <w:rPr>
-                <w:rFonts w:ascii="Times New Roman" w:hAnsi="Times New Roman" w:eastAsia="Times New Roman"/>
-                <w:b w:val="0"/>
-                <w:color w:val="000000"/>
-                <w:sz w:val="20"/>
-              </w:rPr>
-              <w:t>area, perimeter, нулевой радиус</w:t>
-            </w:r>
-          </w:p>
-        </w:tc>
-        <w:tc>
-          <w:tcPr>
-            <w:tcW w:type="dxa" w:w="2422"/>
-            <w:vAlign w:val="center"/>
-            <w:tcMar>
-              <w:top w:w="100" w:type="dxa"/>
-              <w:left w:w="100" w:type="dxa"/>
-              <w:bottom w:w="100" w:type="dxa"/>
-              <w:right w:w="100" w:type="dxa"/>
-            </w:tcMar>
-          </w:tcPr>
-          <w:p>
-            <w:pPr>
-              <w:spacing w:after="0" w:line="240" w:lineRule="auto"/>
-              <w:jc w:val="center"/>
-            </w:pPr>
-            <w:r>
-              <w:rPr>
-                <w:rFonts w:ascii="Times New Roman" w:hAnsi="Times New Roman" w:eastAsia="Times New Roman"/>
-                <w:b w:val="0"/>
-                <w:color w:val="000000"/>
-                <w:sz w:val="20"/>
-              </w:rPr>
-              <w:t>3</w:t>
-            </w:r>
-          </w:p>
-        </w:tc>
-        <w:tc>
-          <w:tcPr>
-            <w:tcW w:type="dxa" w:w="2422"/>
-            <w:vAlign w:val="center"/>
-            <w:tcMar>
-              <w:top w:w="100" w:type="dxa"/>
-              <w:left w:w="100" w:type="dxa"/>
-              <w:bottom w:w="100" w:type="dxa"/>
-              <w:right w:w="100" w:type="dxa"/>
-            </w:tcMar>
-          </w:tcPr>
-          <w:p>
-            <w:pPr>
-              <w:spacing w:after="0" w:line="240" w:lineRule="auto"/>
-              <w:jc w:val="center"/>
-            </w:pPr>
-            <w:r>
-              <w:rPr>
-                <w:rFonts w:ascii="Times New Roman" w:hAnsi="Times New Roman" w:eastAsia="Times New Roman"/>
-                <w:b w:val="0"/>
-                <w:color w:val="000000"/>
-                <w:sz w:val="20"/>
-              </w:rPr>
-              <w:t>OK</w:t>
-            </w:r>
-          </w:p>
-        </w:tc>
-      </w:tr>
-      <w:tr>
-        <w:tc>
-          <w:tcPr>
-            <w:tcW w:type="dxa" w:w="2422"/>
-            <w:vAlign w:val="center"/>
-            <w:tcMar>
-              <w:top w:w="100" w:type="dxa"/>
-              <w:left w:w="100" w:type="dxa"/>
-              <w:bottom w:w="100" w:type="dxa"/>
-              <w:right w:w="100" w:type="dxa"/>
-            </w:tcMar>
-          </w:tcPr>
-          <w:p>
-            <w:pPr>
-              <w:spacing w:after="0" w:line="240" w:lineRule="auto"/>
-              <w:jc w:val="center"/>
-            </w:pPr>
-            <w:r>
-              <w:rPr>
-                <w:rFonts w:ascii="Times New Roman" w:hAnsi="Times New Roman" w:eastAsia="Times New Roman"/>
-                <w:b w:val="0"/>
-                <w:color w:val="000000"/>
-                <w:sz w:val="20"/>
-              </w:rPr>
-              <w:t>Прямоугольник</w:t>
-            </w:r>
-          </w:p>
-        </w:tc>
-        <w:tc>
-          <w:tcPr>
-            <w:tcW w:type="dxa" w:w="2422"/>
-            <w:vAlign w:val="center"/>
-            <w:tcMar>
-              <w:top w:w="100" w:type="dxa"/>
-              <w:left w:w="100" w:type="dxa"/>
-              <w:bottom w:w="100" w:type="dxa"/>
-              <w:right w:w="100" w:type="dxa"/>
-            </w:tcMar>
-          </w:tcPr>
-          <w:p>
-            <w:pPr>
-              <w:spacing w:after="0" w:line="240" w:lineRule="auto"/>
-              <w:jc w:val="left"/>
-            </w:pPr>
-            <w:r>
-              <w:rPr>
-                <w:rFonts w:ascii="Times New Roman" w:hAnsi="Times New Roman" w:eastAsia="Times New Roman"/>
-                <w:b w:val="0"/>
-                <w:color w:val="000000"/>
-                <w:sz w:val="20"/>
-              </w:rPr>
-              <w:t>area, perimeter, нулевая сторона</w:t>
-            </w:r>
-          </w:p>
-        </w:tc>
-        <w:tc>
-          <w:tcPr>
-            <w:tcW w:type="dxa" w:w="2422"/>
-            <w:vAlign w:val="center"/>
-            <w:tcMar>
-              <w:top w:w="100" w:type="dxa"/>
-              <w:left w:w="100" w:type="dxa"/>
-              <w:bottom w:w="100" w:type="dxa"/>
-              <w:right w:w="100" w:type="dxa"/>
-            </w:tcMar>
-          </w:tcPr>
-          <w:p>
-            <w:pPr>
-              <w:spacing w:after="0" w:line="240" w:lineRule="auto"/>
-              <w:jc w:val="center"/>
-            </w:pPr>
-            <w:r>
-              <w:rPr>
-                <w:rFonts w:ascii="Times New Roman" w:hAnsi="Times New Roman" w:eastAsia="Times New Roman"/>
-                <w:b w:val="0"/>
-                <w:color w:val="000000"/>
-                <w:sz w:val="20"/>
-              </w:rPr>
-              <w:t>3</w:t>
-            </w:r>
-          </w:p>
-        </w:tc>
-        <w:tc>
-          <w:tcPr>
-            <w:tcW w:type="dxa" w:w="2422"/>
-            <w:vAlign w:val="center"/>
-            <w:tcMar>
-              <w:top w:w="100" w:type="dxa"/>
-              <w:left w:w="100" w:type="dxa"/>
-              <w:bottom w:w="100" w:type="dxa"/>
-              <w:right w:w="100" w:type="dxa"/>
-            </w:tcMar>
-          </w:tcPr>
-          <w:p>
-            <w:pPr>
-              <w:spacing w:after="0" w:line="240" w:lineRule="auto"/>
-              <w:jc w:val="center"/>
-            </w:pPr>
-            <w:r>
-              <w:rPr>
-                <w:rFonts w:ascii="Times New Roman" w:hAnsi="Times New Roman" w:eastAsia="Times New Roman"/>
-                <w:b w:val="0"/>
-                <w:color w:val="000000"/>
-                <w:sz w:val="20"/>
-              </w:rPr>
-              <w:t>OK</w:t>
-            </w:r>
-          </w:p>
-        </w:tc>
-      </w:tr>
-      <w:tr>
-        <w:tc>
-          <w:tcPr>
-            <w:tcW w:type="dxa" w:w="2422"/>
-            <w:vAlign w:val="center"/>
-            <w:tcMar>
-              <w:top w:w="100" w:type="dxa"/>
-              <w:left w:w="100" w:type="dxa"/>
-              <w:bottom w:w="100" w:type="dxa"/>
-              <w:right w:w="100" w:type="dxa"/>
-            </w:tcMar>
-          </w:tcPr>
-          <w:p>
-            <w:pPr>
-              <w:spacing w:after="0" w:line="240" w:lineRule="auto"/>
-              <w:jc w:val="center"/>
-            </w:pPr>
-            <w:r>
-              <w:rPr>
-                <w:rFonts w:ascii="Times New Roman" w:hAnsi="Times New Roman" w:eastAsia="Times New Roman"/>
-                <w:b w:val="0"/>
-                <w:color w:val="000000"/>
-                <w:sz w:val="20"/>
-              </w:rPr>
-              <w:t>Квадрат</w:t>
-            </w:r>
-          </w:p>
-        </w:tc>
-        <w:tc>
-          <w:tcPr>
-            <w:tcW w:type="dxa" w:w="2422"/>
-            <w:vAlign w:val="center"/>
-            <w:tcMar>
-              <w:top w:w="100" w:type="dxa"/>
-              <w:left w:w="100" w:type="dxa"/>
-              <w:bottom w:w="100" w:type="dxa"/>
-              <w:right w:w="100" w:type="dxa"/>
-            </w:tcMar>
-          </w:tcPr>
-          <w:p>
-            <w:pPr>
-              <w:spacing w:after="0" w:line="240" w:lineRule="auto"/>
-              <w:jc w:val="left"/>
-            </w:pPr>
-            <w:r>
-              <w:rPr>
-                <w:rFonts w:ascii="Times New Roman" w:hAnsi="Times New Roman" w:eastAsia="Times New Roman"/>
-                <w:b w:val="0"/>
-                <w:color w:val="000000"/>
-                <w:sz w:val="20"/>
-              </w:rPr>
-              <w:t>area, perimeter, нулевая сторона</w:t>
-            </w:r>
-          </w:p>
-        </w:tc>
-        <w:tc>
-          <w:tcPr>
-            <w:tcW w:type="dxa" w:w="2422"/>
-            <w:vAlign w:val="center"/>
-            <w:tcMar>
-              <w:top w:w="100" w:type="dxa"/>
-              <w:left w:w="100" w:type="dxa"/>
-              <w:bottom w:w="100" w:type="dxa"/>
-              <w:right w:w="100" w:type="dxa"/>
-            </w:tcMar>
-          </w:tcPr>
-          <w:p>
-            <w:pPr>
-              <w:spacing w:after="0" w:line="240" w:lineRule="auto"/>
-              <w:jc w:val="center"/>
-            </w:pPr>
-            <w:r>
-              <w:rPr>
-                <w:rFonts w:ascii="Times New Roman" w:hAnsi="Times New Roman" w:eastAsia="Times New Roman"/>
-                <w:b w:val="0"/>
-                <w:color w:val="000000"/>
-                <w:sz w:val="20"/>
-              </w:rPr>
-              <w:t>3</w:t>
-            </w:r>
-          </w:p>
-        </w:tc>
-        <w:tc>
-          <w:tcPr>
-            <w:tcW w:type="dxa" w:w="2422"/>
-            <w:vAlign w:val="center"/>
-            <w:tcMar>
-              <w:top w:w="100" w:type="dxa"/>
-              <w:left w:w="100" w:type="dxa"/>
-              <w:bottom w:w="100" w:type="dxa"/>
-              <w:right w:w="100" w:type="dxa"/>
-            </w:tcMar>
-          </w:tcPr>
-          <w:p>
-            <w:pPr>
-              <w:spacing w:after="0" w:line="240" w:lineRule="auto"/>
-              <w:jc w:val="center"/>
-            </w:pPr>
-            <w:r>
-              <w:rPr>
-                <w:rFonts w:ascii="Times New Roman" w:hAnsi="Times New Roman" w:eastAsia="Times New Roman"/>
-                <w:b w:val="0"/>
-                <w:color w:val="000000"/>
-                <w:sz w:val="20"/>
-              </w:rPr>
-              <w:t>OK</w:t>
-            </w:r>
-          </w:p>
-        </w:tc>
-      </w:tr>
-      <w:tr>
-        <w:tc>
-          <w:tcPr>
-            <w:tcW w:type="dxa" w:w="2422"/>
-            <w:vAlign w:val="center"/>
-            <w:tcMar>
-              <w:top w:w="100" w:type="dxa"/>
-              <w:left w:w="100" w:type="dxa"/>
-              <w:bottom w:w="100" w:type="dxa"/>
-              <w:right w:w="100" w:type="dxa"/>
-            </w:tcMar>
-          </w:tcPr>
-          <w:p>
-            <w:pPr>
-              <w:spacing w:after="0" w:line="240" w:lineRule="auto"/>
-              <w:jc w:val="center"/>
-            </w:pPr>
-            <w:r>
-              <w:rPr>
-                <w:rFonts w:ascii="Times New Roman" w:hAnsi="Times New Roman" w:eastAsia="Times New Roman"/>
-                <w:b w:val="0"/>
-                <w:color w:val="000000"/>
-                <w:sz w:val="20"/>
-              </w:rPr>
-              <w:t>Треугольник</w:t>
-            </w:r>
-          </w:p>
-        </w:tc>
-        <w:tc>
-          <w:tcPr>
-            <w:tcW w:type="dxa" w:w="2422"/>
-            <w:vAlign w:val="center"/>
-            <w:tcMar>
-              <w:top w:w="100" w:type="dxa"/>
-              <w:left w:w="100" w:type="dxa"/>
-              <w:bottom w:w="100" w:type="dxa"/>
-              <w:right w:w="100" w:type="dxa"/>
-            </w:tcMar>
-          </w:tcPr>
-          <w:p>
-            <w:pPr>
-              <w:spacing w:after="0" w:line="240" w:lineRule="auto"/>
-              <w:jc w:val="left"/>
-            </w:pPr>
-            <w:r>
-              <w:rPr>
-                <w:rFonts w:ascii="Times New Roman" w:hAnsi="Times New Roman" w:eastAsia="Times New Roman"/>
-                <w:b w:val="0"/>
-                <w:color w:val="000000"/>
-                <w:sz w:val="20"/>
-              </w:rPr>
-              <w:t>area, perimeter, нулевая высота</w:t>
-            </w:r>
-          </w:p>
-        </w:tc>
-        <w:tc>
-          <w:tcPr>
-            <w:tcW w:type="dxa" w:w="2422"/>
-            <w:vAlign w:val="center"/>
-            <w:tcMar>
-              <w:top w:w="100" w:type="dxa"/>
-              <w:left w:w="100" w:type="dxa"/>
-              <w:bottom w:w="100" w:type="dxa"/>
-              <w:right w:w="100" w:type="dxa"/>
-            </w:tcMar>
-          </w:tcPr>
-          <w:p>
-            <w:pPr>
-              <w:spacing w:after="0" w:line="240" w:lineRule="auto"/>
-              <w:jc w:val="center"/>
-            </w:pPr>
-            <w:r>
-              <w:rPr>
-                <w:rFonts w:ascii="Times New Roman" w:hAnsi="Times New Roman" w:eastAsia="Times New Roman"/>
-                <w:b w:val="0"/>
-                <w:color w:val="000000"/>
-                <w:sz w:val="20"/>
-              </w:rPr>
-              <w:t>3</w:t>
-            </w:r>
-          </w:p>
-        </w:tc>
-        <w:tc>
-          <w:tcPr>
-            <w:tcW w:type="dxa" w:w="2422"/>
-            <w:vAlign w:val="center"/>
-            <w:tcMar>
-              <w:top w:w="100" w:type="dxa"/>
-              <w:left w:w="100" w:type="dxa"/>
-              <w:bottom w:w="100" w:type="dxa"/>
-              <w:right w:w="100" w:type="dxa"/>
-            </w:tcMar>
-          </w:tcPr>
-          <w:p>
-            <w:pPr>
-              <w:spacing w:after="0" w:line="240" w:lineRule="auto"/>
-              <w:jc w:val="center"/>
-            </w:pPr>
-            <w:r>
-              <w:rPr>
-                <w:rFonts w:ascii="Times New Roman" w:hAnsi="Times New Roman" w:eastAsia="Times New Roman"/>
-                <w:b w:val="0"/>
-                <w:color w:val="000000"/>
-                <w:sz w:val="20"/>
-              </w:rPr>
-              <w:t>OK</w:t>
-            </w:r>
-          </w:p>
-        </w:tc>
-      </w:tr>
-    </w:tbl>
-    <w:p>
-      <w:pPr>
-        <w:spacing w:before="160" w:after="120"/>
+        <w:spacing w:after="120" w:line="240" w:lineRule="auto"/>
+        <w:ind w:firstLine="0" w:left="0"/>
+        <w:jc w:val="left"/>
       </w:pPr>
       <w:r>
         <w:rPr>
@@ -1339,52 +553,190 @@
           <w:color w:val="000000"/>
           <w:sz w:val="24"/>
         </w:rPr>
-        <w:t>Итоговый вывод unittest:</w:t>
+        <w:t>1. Цели и задачи тестирования.</w:t>
       </w:r>
-    </w:p>
-    <w:p>
-      <w:pPr>
-        <w:spacing w:after="160" w:line="240" w:lineRule="auto"/>
-        <w:ind w:left="360"/>
-      </w:pPr>
-      <w:r>
-        <w:rPr>
-          <w:rFonts w:ascii="Courier New" w:hAnsi="Courier New" w:eastAsia="Courier New"/>
-          <w:color w:val="000000"/>
-          <w:sz w:val="20"/>
-        </w:rPr>
-        <w:t>Ran 12 tests in 0.000s</w:t>
-        <w:br/>
-        <w:br/>
-        <w:t>OK</w:t>
-      </w:r>
-    </w:p>
-    <w:p>
-      <w:pPr>
-        <w:keepNext/>
-        <w:spacing w:before="200" w:after="120"/>
-      </w:pPr>
-      <w:r>
-        <w:rPr>
-          <w:rFonts w:ascii="Times New Roman" w:hAnsi="Times New Roman" w:eastAsia="Times New Roman"/>
-          <w:b/>
-          <w:color w:val="000000"/>
-          <w:sz w:val="26"/>
-        </w:rPr>
-        <w:t>8. Выводы из результатов тестирования</w:t>
-      </w:r>
-    </w:p>
-    <w:p>
-      <w:pPr>
-        <w:spacing w:after="120" w:line="276" w:lineRule="auto"/>
-        <w:jc w:val="both"/>
-      </w:pPr>
       <w:r>
         <w:rPr>
           <w:rFonts w:ascii="Times New Roman" w:hAnsi="Times New Roman" w:eastAsia="Times New Roman"/>
           <w:color w:val="000000"/>
           <w:sz w:val="24"/>
         </w:rPr>
+        <w:br/>
+        <w:t>Цель работы — проверить корректность вычисления площади и периметра четырёх геометрических фигур. Задачи тестирования: подготовить независимые unit-тесты, сравнить результаты функций с заранее рассчитанными значениями и зафиксировать результат автоматического запуска.</w:t>
+      </w:r>
+    </w:p>
+    <w:p>
+      <w:pPr>
+        <w:spacing w:after="120" w:line="240" w:lineRule="auto"/>
+        <w:ind w:firstLine="0" w:left="0"/>
+        <w:jc w:val="left"/>
+      </w:pPr>
+      <w:r>
+        <w:rPr>
+          <w:rFonts w:ascii="Times New Roman" w:hAnsi="Times New Roman" w:eastAsia="Times New Roman"/>
+          <w:b/>
+          <w:color w:val="000000"/>
+          <w:sz w:val="24"/>
+        </w:rPr>
+        <w:t>2. Описание тестируемого продукта.</w:t>
+      </w:r>
+      <w:r>
+        <w:rPr>
+          <w:rFonts w:ascii="Times New Roman" w:hAnsi="Times New Roman" w:eastAsia="Times New Roman"/>
+          <w:color w:val="000000"/>
+          <w:sz w:val="24"/>
+        </w:rPr>
+        <w:br/>
+        <w:t>Тестируется Python-приложение из четырёх модулей: circle, rectangle, square и triangle. Каждый модуль содержит функции area и perimeter. Функции принимают числовые размеры фигуры и возвращают результат вычисления по стандартной геометрической формуле. Проверка допустимости входных данных приложением не выполняется.</w:t>
+      </w:r>
+    </w:p>
+    <w:p>
+      <w:pPr>
+        <w:spacing w:after="120" w:line="240" w:lineRule="auto"/>
+        <w:ind w:firstLine="0" w:left="0"/>
+        <w:jc w:val="left"/>
+      </w:pPr>
+      <w:r>
+        <w:rPr>
+          <w:rFonts w:ascii="Times New Roman" w:hAnsi="Times New Roman" w:eastAsia="Times New Roman"/>
+          <w:b/>
+          <w:color w:val="000000"/>
+          <w:sz w:val="24"/>
+        </w:rPr>
+        <w:t>3. Область тестирования.</w:t>
+      </w:r>
+      <w:r>
+        <w:rPr>
+          <w:rFonts w:ascii="Times New Roman" w:hAnsi="Times New Roman" w:eastAsia="Times New Roman"/>
+          <w:color w:val="000000"/>
+          <w:sz w:val="24"/>
+        </w:rPr>
+        <w:br/>
+        <w:t>В область тестирования входят восемь функций: площадь и периметр круга, прямоугольника, квадрата и треугольника. Проверяются целые и дробные значения, а также граничный случай с нулевым размером. Внешние интерфейсы, производительность и безопасность не рассматриваются.</w:t>
+      </w:r>
+    </w:p>
+    <w:p>
+      <w:pPr>
+        <w:spacing w:after="120" w:line="240" w:lineRule="auto"/>
+        <w:ind w:firstLine="0" w:left="0"/>
+        <w:jc w:val="left"/>
+      </w:pPr>
+      <w:r>
+        <w:rPr>
+          <w:rFonts w:ascii="Times New Roman" w:hAnsi="Times New Roman" w:eastAsia="Times New Roman"/>
+          <w:b/>
+          <w:color w:val="000000"/>
+          <w:sz w:val="24"/>
+        </w:rPr>
+        <w:t>4. Стратегия тестирования.</w:t>
+      </w:r>
+      <w:r>
+        <w:rPr>
+          <w:rFonts w:ascii="Times New Roman" w:hAnsi="Times New Roman" w:eastAsia="Times New Roman"/>
+          <w:color w:val="000000"/>
+          <w:sz w:val="24"/>
+        </w:rPr>
+        <w:br/>
+        <w:t>Используется функциональное модульное тестирование средствами стандартной библиотеки unittest. Тесты оформлены в классах, унаследованных от unittest.TestCase, и запускаются командой python -m unittest discover -s tests -v. Для точных результатов применяется assertEqual, для вычислений с числом π — assertAlmostEqual.</w:t>
+      </w:r>
+    </w:p>
+    <w:p>
+      <w:pPr>
+        <w:spacing w:after="120" w:line="240" w:lineRule="auto"/>
+        <w:ind w:firstLine="0" w:left="0"/>
+        <w:jc w:val="left"/>
+      </w:pPr>
+      <w:r>
+        <w:rPr>
+          <w:rFonts w:ascii="Times New Roman" w:hAnsi="Times New Roman" w:eastAsia="Times New Roman"/>
+          <w:b/>
+          <w:color w:val="000000"/>
+          <w:sz w:val="24"/>
+        </w:rPr>
+        <w:t>5. Критерии приёмки.</w:t>
+      </w:r>
+      <w:r>
+        <w:rPr>
+          <w:rFonts w:ascii="Times New Roman" w:hAnsi="Times New Roman" w:eastAsia="Times New Roman"/>
+          <w:color w:val="000000"/>
+          <w:sz w:val="24"/>
+        </w:rPr>
+        <w:br/>
+        <w:t>Работа считается принятой, если unittest обнаруживает тесты всех четырёх фигур, каждая функция area и perimeter проверена хотя бы одним тестом, все тесты завершаются со статусом OK, а модули приложения импортируются без ошибок.</w:t>
+      </w:r>
+    </w:p>
+    <w:p>
+      <w:pPr>
+        <w:spacing w:after="120" w:line="240" w:lineRule="auto"/>
+        <w:ind w:firstLine="0" w:left="0"/>
+        <w:jc w:val="left"/>
+      </w:pPr>
+      <w:r>
+        <w:rPr>
+          <w:rFonts w:ascii="Times New Roman" w:hAnsi="Times New Roman" w:eastAsia="Times New Roman"/>
+          <w:b/>
+          <w:color w:val="000000"/>
+          <w:sz w:val="24"/>
+        </w:rPr>
+        <w:t>6. Ожидаемые результаты.</w:t>
+      </w:r>
+      <w:r>
+        <w:rPr>
+          <w:rFonts w:ascii="Times New Roman" w:hAnsi="Times New Roman" w:eastAsia="Times New Roman"/>
+          <w:color w:val="000000"/>
+          <w:sz w:val="24"/>
+        </w:rPr>
+        <w:br/>
+        <w:t>Ожидается успешное выполнение 12 тестов. Для каждого набора входных данных результат функции должен совпасть с рассчитанным значением. При несовпадении unittest должен вывести имя проваленного теста и описание ошибки сравнения.</w:t>
+      </w:r>
+    </w:p>
+    <w:p>
+      <w:pPr>
+        <w:spacing w:after="120" w:line="240" w:lineRule="auto"/>
+        <w:ind w:firstLine="0" w:left="0"/>
+        <w:jc w:val="left"/>
+      </w:pPr>
+      <w:r>
+        <w:rPr>
+          <w:rFonts w:ascii="Times New Roman" w:hAnsi="Times New Roman" w:eastAsia="Times New Roman"/>
+          <w:b/>
+          <w:color w:val="000000"/>
+          <w:sz w:val="24"/>
+        </w:rPr>
+        <w:t>7. Актуальные результаты тестирования.</w:t>
+      </w:r>
+      <w:r>
+        <w:rPr>
+          <w:rFonts w:ascii="Times New Roman" w:hAnsi="Times New Roman" w:eastAsia="Times New Roman"/>
+          <w:color w:val="000000"/>
+          <w:sz w:val="24"/>
+        </w:rPr>
+        <w:br/>
+        <w:t>Команда python -m unittest discover -s tests -v обнаружила и выполнила 12 тестов. Для круга, прямоугольника, квадрата и треугольника выполнено по три теста. Все проверки завершились успешно, итоговый статус — OK.</w:t>
+      </w:r>
+    </w:p>
+    <w:p>
+      <w:pPr>
+        <w:spacing w:after="120" w:line="240" w:lineRule="auto"/>
+        <w:ind w:firstLine="0" w:left="0"/>
+        <w:jc w:val="left"/>
+      </w:pPr>
+      <w:r>
+        <w:rPr>
+          <w:rFonts w:ascii="Times New Roman" w:hAnsi="Times New Roman" w:eastAsia="Times New Roman"/>
+          <w:b/>
+          <w:color w:val="000000"/>
+          <w:sz w:val="24"/>
+        </w:rPr>
+        <w:t>8. Выводы из результатов тестирования.</w:t>
+      </w:r>
+      <w:r>
+        <w:rPr>
+          <w:rFonts w:ascii="Times New Roman" w:hAnsi="Times New Roman" w:eastAsia="Times New Roman"/>
+          <w:color w:val="000000"/>
+          <w:sz w:val="24"/>
+        </w:rPr>
+        <w:br/>
         <w:t>Все функции приложения работают в соответствии с используемыми формулами на подготовленных наборах данных. Тестами покрыты все четыре фигуры и обе операции каждого модуля. Дефекты в проверенных сценариях не обнаружены. Исходный код тестов размещён в каталоге tests, а результат добавления тестов фиксируется в истории Git репозитория.</w:t>
       </w:r>
     </w:p>

</xml_diff>